<commit_message>
# Melhorando Projeto de Testes Automatizados Fixtures
Melhorando Projeto de Testes Automatizados Fixtures
• Fixtures são arquivos estáticos, normalmente JSON, usados para centralizar massas de teste.
• Para alterar somente um campo sem modificar o objeto original, pode-se usar cópia rasa com spread: {
...objeto }.
• Em objetos aninhados, uma cópia profunda como structuredClone(objeto) evita compartilhamento de referências internas.
</commit_message>
<xml_diff>
--- a/Modulo_4_Testando_Automatizando_API/Desafio - Resumo modulo 4 - Testando_Automatizando_API.docx
+++ b/Modulo_4_Testando_Automatizando_API/Desafio - Resumo modulo 4 - Testando_Automatizando_API.docx
@@ -333,7 +333,6 @@
         <w:t xml:space="preserve"> </w:t>
       </w:r>
       <w:proofErr w:type="spellStart"/>
-      <w:proofErr w:type="gramStart"/>
       <w:r>
         <w:t>julio</w:t>
       </w:r>
@@ -341,7 +340,6 @@
         <w:t>.lima</w:t>
       </w:r>
       <w:proofErr w:type="spellEnd"/>
-      <w:proofErr w:type="gramEnd"/>
       <w:r>
         <w:t xml:space="preserve"> (acesso total)</w:t>
       </w:r>
@@ -349,7 +347,6 @@
         <w:t xml:space="preserve"> e </w:t>
       </w:r>
       <w:proofErr w:type="spellStart"/>
-      <w:proofErr w:type="gramStart"/>
       <w:r>
         <w:t>junior</w:t>
       </w:r>
@@ -357,7 +354,6 @@
         <w:t>.lima</w:t>
       </w:r>
       <w:proofErr w:type="spellEnd"/>
-      <w:proofErr w:type="gramEnd"/>
       <w:r>
         <w:t xml:space="preserve"> (acesso limitado) acesso total</w:t>
       </w:r>
@@ -588,6 +584,7 @@
         <w:spacing w:before="0" w:after="0" w:line="276" w:lineRule="auto"/>
       </w:pPr>
       <w:r>
+        <w:lastRenderedPageBreak/>
         <w:t>Heurística VADER</w:t>
       </w:r>
     </w:p>
@@ -1386,6 +1383,7 @@
       </w:pPr>
       <w:proofErr w:type="spellStart"/>
       <w:r>
+        <w:lastRenderedPageBreak/>
         <w:t>Get</w:t>
       </w:r>
       <w:proofErr w:type="spellEnd"/>
@@ -2002,6 +2000,7 @@
           <w:b/>
           <w:bCs/>
         </w:rPr>
+        <w:lastRenderedPageBreak/>
         <w:t>}</w:t>
       </w:r>
     </w:p>
@@ -2230,7 +2229,11 @@
         <w:t>E – Error</w:t>
       </w:r>
     </w:p>
-    <w:p/>
+    <w:p>
+      <w:pPr>
+        <w:spacing w:after="0"/>
+      </w:pPr>
+    </w:p>
     <w:tbl>
       <w:tblPr>
         <w:tblStyle w:val="Tabelacomgrade"/>
@@ -2412,6 +2415,7 @@
           </w:tcPr>
           <w:p>
             <w:r>
+              <w:lastRenderedPageBreak/>
               <w:t>422</w:t>
             </w:r>
           </w:p>
@@ -2456,7 +2460,11 @@
         </w:tc>
       </w:tr>
     </w:tbl>
-    <w:p/>
+    <w:p>
+      <w:pPr>
+        <w:spacing w:after="0"/>
+      </w:pPr>
+    </w:p>
     <w:p>
       <w:pPr>
         <w:spacing w:after="0"/>
@@ -2966,6 +2974,7 @@
           <w:b/>
           <w:bCs/>
         </w:rPr>
+        <w:lastRenderedPageBreak/>
         <w:t>Falta de tratamento de exceções</w:t>
       </w:r>
       <w:r>
@@ -3307,13 +3316,14 @@
       </w:pPr>
       <w:r>
         <w:pict w14:anchorId="4B87C44C">
-          <v:rect id="_x0000_i1028" style="width:0;height:1.5pt" o:hralign="center" o:bullet="t" o:hrstd="t" o:hr="t" fillcolor="#a0a0a0" stroked="f"/>
+          <v:rect id="_x0000_i1026" style="width:0;height:1.5pt" o:hralign="center" o:bullet="t" o:hrstd="t" o:hr="t" fillcolor="#a0a0a0" stroked="f"/>
         </w:pict>
       </w:r>
     </w:p>
     <w:p>
       <w:pPr>
         <w:pStyle w:val="Ttulo"/>
+        <w:spacing w:after="0"/>
         <w:jc w:val="center"/>
       </w:pPr>
       <w:r>
@@ -3372,7 +3382,6 @@
         <w:spacing w:after="0"/>
       </w:pPr>
       <w:proofErr w:type="spellStart"/>
-      <w:proofErr w:type="gramStart"/>
       <w:r>
         <w:rPr>
           <w:b/>
@@ -3386,15 +3395,7 @@
           <w:b/>
           <w:bCs/>
         </w:rPr>
-        <w:t xml:space="preserve"> :</w:t>
-      </w:r>
-      <w:proofErr w:type="gramEnd"/>
-      <w:r>
-        <w:rPr>
-          <w:b/>
-          <w:bCs/>
-        </w:rPr>
-        <w:t xml:space="preserve"> </w:t>
+        <w:t xml:space="preserve"> : </w:t>
       </w:r>
       <w:r>
         <w:t>Biblioteca utilizada para realizar requisições HTTP e testar APIs.</w:t>
@@ -3728,22 +3729,21 @@
         <w:t xml:space="preserve">Acesse o </w:t>
       </w:r>
       <w:proofErr w:type="spellStart"/>
-      <w:proofErr w:type="gramStart"/>
       <w:r>
         <w:t>package.json</w:t>
       </w:r>
       <w:proofErr w:type="spellEnd"/>
-      <w:proofErr w:type="gramEnd"/>
-    </w:p>
-    <w:p>
-      <w:pPr>
-        <w:pStyle w:val="PargrafodaLista"/>
-        <w:spacing w:after="0"/>
-      </w:pPr>
-    </w:p>
-    <w:p>
-      <w:pPr>
-        <w:pStyle w:val="PargrafodaLista"/>
+    </w:p>
+    <w:p>
+      <w:pPr>
+        <w:pStyle w:val="PargrafodaLista"/>
+        <w:spacing w:after="0"/>
+      </w:pPr>
+    </w:p>
+    <w:p>
+      <w:pPr>
+        <w:pStyle w:val="PargrafodaLista"/>
+        <w:spacing w:after="0"/>
       </w:pPr>
       <w:r>
         <w:t>  "scripts": {</w:t>
@@ -3752,6 +3752,7 @@
     <w:p>
       <w:pPr>
         <w:pStyle w:val="PargrafodaLista"/>
+        <w:spacing w:after="0"/>
       </w:pPr>
       <w:r>
         <w:t>    "</w:t>
@@ -3762,15 +3763,7 @@
       </w:r>
       <w:proofErr w:type="spellEnd"/>
       <w:r>
-        <w:t>": "</w:t>
-      </w:r>
-      <w:proofErr w:type="gramStart"/>
-      <w:r>
-        <w:t>mocha .</w:t>
-      </w:r>
-      <w:proofErr w:type="gramEnd"/>
-      <w:r>
-        <w:t>/</w:t>
+        <w:t>": "mocha ./</w:t>
       </w:r>
       <w:proofErr w:type="spellStart"/>
       <w:r>
@@ -3784,6 +3777,7 @@
     <w:p>
       <w:pPr>
         <w:pStyle w:val="PargrafodaLista"/>
+        <w:spacing w:after="0"/>
       </w:pPr>
       <w:r>
         <w:t>  }</w:t>
@@ -3796,6 +3790,7 @@
           <w:ilvl w:val="0"/>
           <w:numId w:val="9"/>
         </w:numPr>
+        <w:spacing w:after="0"/>
       </w:pPr>
       <w:r>
         <w:t>Executar o mocha</w:t>
@@ -3808,6 +3803,7 @@
           <w:ilvl w:val="1"/>
           <w:numId w:val="9"/>
         </w:numPr>
+        <w:spacing w:after="0"/>
       </w:pPr>
       <w:r>
         <w:t xml:space="preserve">Abra o terminal: </w:t>
@@ -3837,13 +3833,7 @@
         <w:spacing w:before="0" w:after="0"/>
       </w:pPr>
       <w:r>
-        <w:t>G</w:t>
-      </w:r>
-      <w:r>
-        <w:t xml:space="preserve">erando relatórios </w:t>
-      </w:r>
-      <w:r>
-        <w:t>gráficos</w:t>
+        <w:t>Gerando relatórios gráficos</w:t>
       </w:r>
     </w:p>
     <w:p>
@@ -3917,12 +3907,10 @@
         <w:t xml:space="preserve">no </w:t>
       </w:r>
       <w:proofErr w:type="spellStart"/>
-      <w:proofErr w:type="gramStart"/>
       <w:r>
         <w:t>package.json</w:t>
       </w:r>
       <w:proofErr w:type="spellEnd"/>
-      <w:proofErr w:type="gramEnd"/>
       <w:r>
         <w:t xml:space="preserve"> o repórter </w:t>
       </w:r>
@@ -4047,29 +4035,7 @@
           <w:lang w:eastAsia="pt-BR"/>
           <w14:ligatures w14:val="none"/>
         </w:rPr>
-        <w:t>"</w:t>
-      </w:r>
-      <w:proofErr w:type="gramStart"/>
-      <w:r>
-        <w:rPr>
-          <w:rFonts w:ascii="Consolas" w:eastAsia="Times New Roman" w:hAnsi="Consolas" w:cs="Times New Roman"/>
-          <w:color w:val="98C379"/>
-          <w:kern w:val="0"/>
-          <w:lang w:eastAsia="pt-BR"/>
-          <w14:ligatures w14:val="none"/>
-        </w:rPr>
-        <w:t>mocha .</w:t>
-      </w:r>
-      <w:proofErr w:type="gramEnd"/>
-      <w:r>
-        <w:rPr>
-          <w:rFonts w:ascii="Consolas" w:eastAsia="Times New Roman" w:hAnsi="Consolas" w:cs="Times New Roman"/>
-          <w:color w:val="98C379"/>
-          <w:kern w:val="0"/>
-          <w:lang w:eastAsia="pt-BR"/>
-          <w14:ligatures w14:val="none"/>
-        </w:rPr>
-        <w:t>/</w:t>
+        <w:t>"mocha ./</w:t>
       </w:r>
       <w:proofErr w:type="spellStart"/>
       <w:r>
@@ -4182,13 +4148,7 @@
         <w:spacing w:after="0"/>
       </w:pPr>
       <w:r>
-        <w:t xml:space="preserve">a pasta de relatório do mocha é </w:t>
-      </w:r>
-      <w:r>
-        <w:t>temporária</w:t>
-      </w:r>
-      <w:r>
-        <w:t xml:space="preserve">, a adicione no </w:t>
+        <w:t xml:space="preserve">a pasta de relatório do mocha é temporária, a adicione no </w:t>
       </w:r>
       <w:proofErr w:type="spellStart"/>
       <w:r>
@@ -4266,6 +4226,9 @@
       </w:r>
     </w:p>
     <w:p>
+      <w:pPr>
+        <w:spacing w:after="0"/>
+      </w:pPr>
       <w:r>
         <w:br w:type="page"/>
       </w:r>
@@ -4279,6 +4242,9 @@
       </w:r>
     </w:p>
     <w:p>
+      <w:pPr>
+        <w:spacing w:after="0"/>
+      </w:pPr>
       <w:r>
         <w:rPr>
           <w:b/>
@@ -4288,6 +4254,9 @@
       </w:r>
     </w:p>
     <w:p>
+      <w:pPr>
+        <w:spacing w:after="0"/>
+      </w:pPr>
       <w:r>
         <w:rPr>
           <w:b/>
@@ -4297,6 +4266,9 @@
       </w:r>
     </w:p>
     <w:p>
+      <w:pPr>
+        <w:spacing w:after="0"/>
+      </w:pPr>
       <w:r>
         <w:rPr>
           <w:b/>
@@ -4330,14 +4302,18 @@
       </w:hyperlink>
     </w:p>
     <w:p>
+      <w:pPr>
+        <w:spacing w:after="0"/>
+      </w:pPr>
       <w:r>
         <w:pict w14:anchorId="06736B2A">
-          <v:rect id="_x0000_i1180" style="width:0;height:1.5pt" o:hralign="center" o:hrstd="t" o:hr="t" fillcolor="#a0a0a0" stroked="f"/>
+          <v:rect id="_x0000_i1027" style="width:0;height:1.5pt" o:hralign="center" o:hrstd="t" o:hr="t" fillcolor="#a0a0a0" stroked="f"/>
         </w:pict>
       </w:r>
     </w:p>
     <w:p>
       <w:pPr>
+        <w:spacing w:after="0"/>
         <w:rPr>
           <w:b/>
           <w:bCs/>
@@ -4352,6 +4328,9 @@
       </w:r>
     </w:p>
     <w:p>
+      <w:pPr>
+        <w:spacing w:after="0"/>
+      </w:pPr>
       <w:r>
         <w:t xml:space="preserve">Compreender como testar APIs REST de forma estruturada, aplicar a heurística VADER na identificação de cenários de teste e automatizar os principais fluxos utilizando </w:t>
       </w:r>
@@ -4373,14 +4352,18 @@
       </w:r>
     </w:p>
     <w:p>
+      <w:pPr>
+        <w:spacing w:after="0"/>
+      </w:pPr>
       <w:r>
         <w:pict w14:anchorId="14E2E514">
-          <v:rect id="_x0000_i1181" style="width:0;height:1.5pt" o:hralign="center" o:hrstd="t" o:hr="t" fillcolor="#a0a0a0" stroked="f"/>
+          <v:rect id="_x0000_i1028" style="width:0;height:1.5pt" o:hralign="center" o:hrstd="t" o:hr="t" fillcolor="#a0a0a0" stroked="f"/>
         </w:pict>
       </w:r>
     </w:p>
     <w:p>
       <w:pPr>
+        <w:spacing w:after="0"/>
         <w:rPr>
           <w:b/>
           <w:bCs/>
@@ -4395,11 +4378,17 @@
       </w:r>
     </w:p>
     <w:p>
+      <w:pPr>
+        <w:spacing w:after="0"/>
+      </w:pPr>
       <w:r>
         <w:t>Durante o módulo, o ambiente utilizado para os testes foi composto pelos seguintes recursos:</w:t>
       </w:r>
     </w:p>
     <w:p>
+      <w:pPr>
+        <w:spacing w:after="0"/>
+      </w:pPr>
       <w:r>
         <w:rPr>
           <w:b/>
@@ -4409,6 +4398,9 @@
       </w:r>
     </w:p>
     <w:p>
+      <w:pPr>
+        <w:spacing w:after="0"/>
+      </w:pPr>
       <w:r>
         <w:t xml:space="preserve">• Acesso à pasta banco-api pelo </w:t>
       </w:r>
@@ -4434,6 +4426,9 @@
       </w:r>
     </w:p>
     <w:p>
+      <w:pPr>
+        <w:spacing w:after="0"/>
+      </w:pPr>
       <w:proofErr w:type="spellStart"/>
       <w:r>
         <w:t>npm</w:t>
@@ -4452,11 +4447,17 @@
       </w:r>
     </w:p>
     <w:p>
+      <w:pPr>
+        <w:spacing w:after="0"/>
+      </w:pPr>
       <w:r>
         <w:t>• Acesso à aplicação pelo navegador.</w:t>
       </w:r>
     </w:p>
     <w:p>
+      <w:pPr>
+        <w:spacing w:after="0"/>
+      </w:pPr>
       <w:r>
         <w:rPr>
           <w:b/>
@@ -4466,6 +4467,9 @@
       </w:r>
     </w:p>
     <w:p>
+      <w:pPr>
+        <w:spacing w:after="0"/>
+      </w:pPr>
       <w:r>
         <w:t xml:space="preserve">• Acesso à pasta banco-web pelo </w:t>
       </w:r>
@@ -4491,6 +4495,9 @@
       </w:r>
     </w:p>
     <w:p>
+      <w:pPr>
+        <w:spacing w:after="0"/>
+      </w:pPr>
       <w:proofErr w:type="spellStart"/>
       <w:r>
         <w:t>npm</w:t>
@@ -4509,11 +4516,17 @@
       </w:r>
     </w:p>
     <w:p>
+      <w:pPr>
+        <w:spacing w:after="0"/>
+      </w:pPr>
       <w:r>
         <w:t>• Acesso ao sistema pelo navegador.</w:t>
       </w:r>
     </w:p>
     <w:p>
+      <w:pPr>
+        <w:spacing w:after="0"/>
+      </w:pPr>
       <w:r>
         <w:rPr>
           <w:b/>
@@ -4523,6 +4536,9 @@
       </w:r>
     </w:p>
     <w:p>
+      <w:pPr>
+        <w:spacing w:after="0"/>
+      </w:pPr>
       <w:r>
         <w:t>• Banco de dados utilizado: banco.</w:t>
       </w:r>
@@ -4552,14 +4568,18 @@
       </w:r>
     </w:p>
     <w:p>
+      <w:pPr>
+        <w:spacing w:after="0"/>
+      </w:pPr>
       <w:r>
         <w:pict w14:anchorId="5F7AFA4B">
-          <v:rect id="_x0000_i1182" style="width:0;height:1.5pt" o:hralign="center" o:hrstd="t" o:hr="t" fillcolor="#a0a0a0" stroked="f"/>
+          <v:rect id="_x0000_i1029" style="width:0;height:1.5pt" o:hralign="center" o:hrstd="t" o:hr="t" fillcolor="#a0a0a0" stroked="f"/>
         </w:pict>
       </w:r>
     </w:p>
     <w:p>
       <w:pPr>
+        <w:spacing w:after="0"/>
         <w:rPr>
           <w:b/>
           <w:bCs/>
@@ -4574,6 +4594,9 @@
       </w:r>
     </w:p>
     <w:p>
+      <w:pPr>
+        <w:spacing w:after="0"/>
+      </w:pPr>
       <w:r>
         <w:t xml:space="preserve">Testar APIs exige uma mudança de perspectiva em relação aos testes realizados na interface gráfica. Em vez de concentrar a validação em telas, campos e interações visuais, o QA analisa a comunicação entre os sistemas, observando </w:t>
       </w:r>
@@ -4603,6 +4626,9 @@
       </w:r>
     </w:p>
     <w:p>
+      <w:pPr>
+        <w:spacing w:after="0"/>
+      </w:pPr>
       <w:r>
         <w:rPr>
           <w:b/>
@@ -4615,6 +4641,14 @@
       <w:tblPr>
         <w:tblW w:w="0" w:type="auto"/>
         <w:tblCellSpacing w:w="15" w:type="dxa"/>
+        <w:tblBorders>
+          <w:top w:val="single" w:sz="4" w:space="0" w:color="auto"/>
+          <w:left w:val="single" w:sz="4" w:space="0" w:color="auto"/>
+          <w:bottom w:val="single" w:sz="4" w:space="0" w:color="auto"/>
+          <w:right w:val="single" w:sz="4" w:space="0" w:color="auto"/>
+          <w:insideH w:val="single" w:sz="4" w:space="0" w:color="auto"/>
+          <w:insideV w:val="single" w:sz="4" w:space="0" w:color="auto"/>
+        </w:tblBorders>
         <w:tblCellMar>
           <w:top w:w="15" w:type="dxa"/>
           <w:left w:w="15" w:type="dxa"/>
@@ -4624,8 +4658,8 @@
         <w:tblLook w:val="04A0" w:firstRow="1" w:lastRow="0" w:firstColumn="1" w:lastColumn="0" w:noHBand="0" w:noVBand="1"/>
       </w:tblPr>
       <w:tblGrid>
-        <w:gridCol w:w="2314"/>
-        <w:gridCol w:w="2710"/>
+        <w:gridCol w:w="2334"/>
+        <w:gridCol w:w="2730"/>
       </w:tblGrid>
       <w:tr>
         <w:trPr>
@@ -4639,6 +4673,7 @@
           </w:tcPr>
           <w:p>
             <w:pPr>
+              <w:spacing w:after="0"/>
               <w:rPr>
                 <w:b/>
                 <w:bCs/>
@@ -4649,7 +4684,6 @@
                 <w:b/>
                 <w:bCs/>
               </w:rPr>
-              <w:lastRenderedPageBreak/>
               <w:t>Testes de UI</w:t>
             </w:r>
           </w:p>
@@ -4662,6 +4696,7 @@
           </w:tcPr>
           <w:p>
             <w:pPr>
+              <w:spacing w:after="0"/>
               <w:rPr>
                 <w:b/>
                 <w:bCs/>
@@ -4688,6 +4723,9 @@
             <w:hideMark/>
           </w:tcPr>
           <w:p>
+            <w:pPr>
+              <w:spacing w:after="0"/>
+            </w:pPr>
             <w:r>
               <w:t>Formulários</w:t>
             </w:r>
@@ -4700,6 +4738,9 @@
             <w:hideMark/>
           </w:tcPr>
           <w:p>
+            <w:pPr>
+              <w:spacing w:after="0"/>
+            </w:pPr>
             <w:proofErr w:type="spellStart"/>
             <w:r>
               <w:t>Endpoints</w:t>
@@ -4719,6 +4760,9 @@
             <w:hideMark/>
           </w:tcPr>
           <w:p>
+            <w:pPr>
+              <w:spacing w:after="0"/>
+            </w:pPr>
             <w:r>
               <w:t>Telas</w:t>
             </w:r>
@@ -4731,6 +4775,9 @@
             <w:hideMark/>
           </w:tcPr>
           <w:p>
+            <w:pPr>
+              <w:spacing w:after="0"/>
+            </w:pPr>
             <w:r>
               <w:t>Métodos HTTP</w:t>
             </w:r>
@@ -4748,6 +4795,9 @@
             <w:hideMark/>
           </w:tcPr>
           <w:p>
+            <w:pPr>
+              <w:spacing w:after="0"/>
+            </w:pPr>
             <w:r>
               <w:t>Fluxos de navegação</w:t>
             </w:r>
@@ -4760,6 +4810,9 @@
             <w:hideMark/>
           </w:tcPr>
           <w:p>
+            <w:pPr>
+              <w:spacing w:after="0"/>
+            </w:pPr>
             <w:r>
               <w:t>Requisições e respostas</w:t>
             </w:r>
@@ -4777,6 +4830,9 @@
             <w:hideMark/>
           </w:tcPr>
           <w:p>
+            <w:pPr>
+              <w:spacing w:after="0"/>
+            </w:pPr>
             <w:r>
               <w:t>Interações visuais</w:t>
             </w:r>
@@ -4789,6 +4845,9 @@
             <w:hideMark/>
           </w:tcPr>
           <w:p>
+            <w:pPr>
+              <w:spacing w:after="0"/>
+            </w:pPr>
             <w:proofErr w:type="spellStart"/>
             <w:r>
               <w:t>Payloads</w:t>
@@ -4811,6 +4870,9 @@
             <w:hideMark/>
           </w:tcPr>
           <w:p>
+            <w:pPr>
+              <w:spacing w:after="0"/>
+            </w:pPr>
             <w:r>
               <w:t>Campos</w:t>
             </w:r>
@@ -4823,6 +4885,9 @@
             <w:hideMark/>
           </w:tcPr>
           <w:p>
+            <w:pPr>
+              <w:spacing w:after="0"/>
+            </w:pPr>
             <w:r>
               <w:t>Parâmetros</w:t>
             </w:r>
@@ -4840,6 +4905,9 @@
             <w:hideMark/>
           </w:tcPr>
           <w:p>
+            <w:pPr>
+              <w:spacing w:after="0"/>
+            </w:pPr>
             <w:r>
               <w:t>Elementos da interface</w:t>
             </w:r>
@@ -4852,6 +4920,9 @@
             <w:hideMark/>
           </w:tcPr>
           <w:p>
+            <w:pPr>
+              <w:spacing w:after="0"/>
+            </w:pPr>
             <w:r>
               <w:t>Autenticação e autorização</w:t>
             </w:r>
@@ -4869,6 +4940,9 @@
             <w:hideMark/>
           </w:tcPr>
           <w:p>
+            <w:pPr>
+              <w:spacing w:after="0"/>
+            </w:pPr>
             <w:r>
               <w:t>Comportamento visual</w:t>
             </w:r>
@@ -4881,6 +4955,9 @@
             <w:hideMark/>
           </w:tcPr>
           <w:p>
+            <w:pPr>
+              <w:spacing w:after="0"/>
+            </w:pPr>
             <w:r>
               <w:t>Integração entre serviços</w:t>
             </w:r>
@@ -4889,19 +4966,32 @@
       </w:tr>
     </w:tbl>
     <w:p>
-      <w:r>
+      <w:pPr>
+        <w:spacing w:after="0"/>
+      </w:pPr>
+    </w:p>
+    <w:p>
+      <w:pPr>
+        <w:spacing w:after="0"/>
+      </w:pPr>
+      <w:r>
+        <w:lastRenderedPageBreak/>
         <w:t>A validação das regras de negócio continua sendo fundamental nos testes de API, porém passa a ser analisada juntamente com os aspectos técnicos da comunicação entre os serviços.</w:t>
       </w:r>
     </w:p>
     <w:p>
+      <w:pPr>
+        <w:spacing w:after="0"/>
+      </w:pPr>
       <w:r>
         <w:pict w14:anchorId="0BE0FAC6">
-          <v:rect id="_x0000_i1183" style="width:0;height:1.5pt" o:hralign="center" o:hrstd="t" o:hr="t" fillcolor="#a0a0a0" stroked="f"/>
+          <v:rect id="_x0000_i1030" style="width:0;height:1.5pt" o:hralign="center" o:hrstd="t" o:hr="t" fillcolor="#a0a0a0" stroked="f"/>
         </w:pict>
       </w:r>
     </w:p>
     <w:p>
       <w:pPr>
+        <w:spacing w:after="0"/>
         <w:rPr>
           <w:b/>
           <w:bCs/>
@@ -4916,6 +5006,9 @@
       </w:r>
     </w:p>
     <w:p>
+      <w:pPr>
+        <w:spacing w:after="0"/>
+      </w:pPr>
       <w:r>
         <w:t>A heurística VADER foi utilizada como guia para organizar a análise dos principais pontos que devem ser considerados durante os testes de uma API REST.</w:t>
       </w:r>
@@ -4924,6 +5017,14 @@
       <w:tblPr>
         <w:tblW w:w="0" w:type="auto"/>
         <w:tblCellSpacing w:w="15" w:type="dxa"/>
+        <w:tblBorders>
+          <w:top w:val="single" w:sz="4" w:space="0" w:color="auto"/>
+          <w:left w:val="single" w:sz="4" w:space="0" w:color="auto"/>
+          <w:bottom w:val="single" w:sz="4" w:space="0" w:color="auto"/>
+          <w:right w:val="single" w:sz="4" w:space="0" w:color="auto"/>
+          <w:insideH w:val="single" w:sz="4" w:space="0" w:color="auto"/>
+          <w:insideV w:val="single" w:sz="4" w:space="0" w:color="auto"/>
+        </w:tblBorders>
         <w:tblCellMar>
           <w:top w:w="15" w:type="dxa"/>
           <w:left w:w="15" w:type="dxa"/>
@@ -4933,9 +5034,9 @@
         <w:tblLook w:val="04A0" w:firstRow="1" w:lastRow="0" w:firstColumn="1" w:lastColumn="0" w:noHBand="0" w:noVBand="1"/>
       </w:tblPr>
       <w:tblGrid>
-        <w:gridCol w:w="578"/>
-        <w:gridCol w:w="1586"/>
-        <w:gridCol w:w="4778"/>
+        <w:gridCol w:w="598"/>
+        <w:gridCol w:w="1606"/>
+        <w:gridCol w:w="4798"/>
       </w:tblGrid>
       <w:tr>
         <w:trPr>
@@ -4949,6 +5050,7 @@
           </w:tcPr>
           <w:p>
             <w:pPr>
+              <w:spacing w:after="0"/>
               <w:rPr>
                 <w:b/>
                 <w:bCs/>
@@ -4971,6 +5073,7 @@
           </w:tcPr>
           <w:p>
             <w:pPr>
+              <w:spacing w:after="0"/>
               <w:rPr>
                 <w:b/>
                 <w:bCs/>
@@ -4993,6 +5096,7 @@
           </w:tcPr>
           <w:p>
             <w:pPr>
+              <w:spacing w:after="0"/>
               <w:rPr>
                 <w:b/>
                 <w:bCs/>
@@ -5019,6 +5123,9 @@
             <w:hideMark/>
           </w:tcPr>
           <w:p>
+            <w:pPr>
+              <w:spacing w:after="0"/>
+            </w:pPr>
             <w:r>
               <w:rPr>
                 <w:b/>
@@ -5035,6 +5142,9 @@
             <w:hideMark/>
           </w:tcPr>
           <w:p>
+            <w:pPr>
+              <w:spacing w:after="0"/>
+            </w:pPr>
             <w:proofErr w:type="spellStart"/>
             <w:r>
               <w:t>Verbs</w:t>
@@ -5049,6 +5159,9 @@
             <w:hideMark/>
           </w:tcPr>
           <w:p>
+            <w:pPr>
+              <w:spacing w:after="0"/>
+            </w:pPr>
             <w:r>
               <w:t>Métodos HTTP e comportamento esperado</w:t>
             </w:r>
@@ -5066,6 +5179,9 @@
             <w:hideMark/>
           </w:tcPr>
           <w:p>
+            <w:pPr>
+              <w:spacing w:after="0"/>
+            </w:pPr>
             <w:r>
               <w:rPr>
                 <w:b/>
@@ -5082,6 +5198,9 @@
             <w:hideMark/>
           </w:tcPr>
           <w:p>
+            <w:pPr>
+              <w:spacing w:after="0"/>
+            </w:pPr>
             <w:proofErr w:type="spellStart"/>
             <w:r>
               <w:t>Authorization</w:t>
@@ -5096,6 +5215,9 @@
             <w:hideMark/>
           </w:tcPr>
           <w:p>
+            <w:pPr>
+              <w:spacing w:after="0"/>
+            </w:pPr>
             <w:r>
               <w:t>Autenticação, autorização, tokens e permissões</w:t>
             </w:r>
@@ -5113,6 +5235,9 @@
             <w:hideMark/>
           </w:tcPr>
           <w:p>
+            <w:pPr>
+              <w:spacing w:after="0"/>
+            </w:pPr>
             <w:r>
               <w:rPr>
                 <w:b/>
@@ -5129,6 +5254,9 @@
             <w:hideMark/>
           </w:tcPr>
           <w:p>
+            <w:pPr>
+              <w:spacing w:after="0"/>
+            </w:pPr>
             <w:r>
               <w:t>Data</w:t>
             </w:r>
@@ -5141,6 +5269,9 @@
             <w:hideMark/>
           </w:tcPr>
           <w:p>
+            <w:pPr>
+              <w:spacing w:after="0"/>
+            </w:pPr>
             <w:r>
               <w:t>Tipos, formatos, valores, tamanho e paginação</w:t>
             </w:r>
@@ -5158,6 +5289,9 @@
             <w:hideMark/>
           </w:tcPr>
           <w:p>
+            <w:pPr>
+              <w:spacing w:after="0"/>
+            </w:pPr>
             <w:r>
               <w:rPr>
                 <w:b/>
@@ -5174,6 +5308,9 @@
             <w:hideMark/>
           </w:tcPr>
           <w:p>
+            <w:pPr>
+              <w:spacing w:after="0"/>
+            </w:pPr>
             <w:proofErr w:type="spellStart"/>
             <w:r>
               <w:t>Errors</w:t>
@@ -5188,6 +5325,9 @@
             <w:hideMark/>
           </w:tcPr>
           <w:p>
+            <w:pPr>
+              <w:spacing w:after="0"/>
+            </w:pPr>
             <w:r>
               <w:t>Códigos HTTP, mensagens e tratamento de erros</w:t>
             </w:r>
@@ -5205,6 +5345,9 @@
             <w:hideMark/>
           </w:tcPr>
           <w:p>
+            <w:pPr>
+              <w:spacing w:after="0"/>
+            </w:pPr>
             <w:r>
               <w:rPr>
                 <w:b/>
@@ -5221,6 +5364,9 @@
             <w:hideMark/>
           </w:tcPr>
           <w:p>
+            <w:pPr>
+              <w:spacing w:after="0"/>
+            </w:pPr>
             <w:proofErr w:type="spellStart"/>
             <w:r>
               <w:t>Responsiveness</w:t>
@@ -5235,6 +5381,9 @@
             <w:hideMark/>
           </w:tcPr>
           <w:p>
+            <w:pPr>
+              <w:spacing w:after="0"/>
+            </w:pPr>
             <w:r>
               <w:t>Tempo de resposta, timeout e concorrência</w:t>
             </w:r>
@@ -5243,6 +5392,9 @@
       </w:tr>
     </w:tbl>
     <w:p>
+      <w:pPr>
+        <w:spacing w:after="0"/>
+      </w:pPr>
       <w:r>
         <w:t xml:space="preserve">A aplicação da heurística permitiu organizar a investigação dos </w:t>
       </w:r>
@@ -5257,6 +5409,7 @@
     </w:p>
     <w:p>
       <w:pPr>
+        <w:spacing w:after="0"/>
         <w:rPr>
           <w:b/>
           <w:bCs/>
@@ -5280,11 +5433,17 @@
       <w:proofErr w:type="spellEnd"/>
     </w:p>
     <w:p>
+      <w:pPr>
+        <w:spacing w:after="0"/>
+      </w:pPr>
       <w:r>
         <w:t>Foram analisados os principais métodos HTTP utilizados pela API:</w:t>
       </w:r>
     </w:p>
     <w:p>
+      <w:pPr>
+        <w:spacing w:after="0"/>
+      </w:pPr>
       <w:r>
         <w:rPr>
           <w:b/>
@@ -5294,11 +5453,17 @@
       </w:r>
     </w:p>
     <w:p>
+      <w:pPr>
+        <w:spacing w:after="0"/>
+      </w:pPr>
       <w:r>
         <w:t>• POST – realização do login e geração do JWT.</w:t>
       </w:r>
     </w:p>
     <w:p>
+      <w:pPr>
+        <w:spacing w:after="0"/>
+      </w:pPr>
       <w:r>
         <w:rPr>
           <w:b/>
@@ -5308,6 +5473,9 @@
       </w:r>
     </w:p>
     <w:p>
+      <w:pPr>
+        <w:spacing w:after="0"/>
+      </w:pPr>
       <w:r>
         <w:t>• POST – criação de transferência.</w:t>
       </w:r>
@@ -5325,9 +5493,6 @@
       </w:r>
       <w:r>
         <w:br/>
-      </w:r>
-      <w:r>
-        <w:lastRenderedPageBreak/>
         <w:t>• PATCH – atualização parcial.</w:t>
       </w:r>
       <w:r>
@@ -5336,6 +5501,9 @@
       </w:r>
     </w:p>
     <w:p>
+      <w:pPr>
+        <w:spacing w:after="0"/>
+      </w:pPr>
       <w:r>
         <w:rPr>
           <w:b/>
@@ -5345,6 +5513,9 @@
       </w:r>
     </w:p>
     <w:p>
+      <w:pPr>
+        <w:spacing w:after="0"/>
+      </w:pPr>
       <w:r>
         <w:t>• GET – consulta da lista de contas.</w:t>
       </w:r>
@@ -5354,12 +5525,16 @@
       </w:r>
     </w:p>
     <w:p>
+      <w:pPr>
+        <w:spacing w:after="0"/>
+      </w:pPr>
       <w:r>
         <w:t>Também foi considerada a utilização de métodos HTTP não permitidos, verificando se a API apresentou o comportamento esperado.</w:t>
       </w:r>
     </w:p>
     <w:p>
       <w:pPr>
+        <w:spacing w:after="0"/>
         <w:rPr>
           <w:b/>
           <w:bCs/>
@@ -5399,6 +5574,9 @@
       <w:proofErr w:type="spellEnd"/>
     </w:p>
     <w:p>
+      <w:pPr>
+        <w:spacing w:after="0"/>
+      </w:pPr>
       <w:r>
         <w:rPr>
           <w:b/>
@@ -5408,11 +5586,17 @@
       </w:r>
     </w:p>
     <w:p>
+      <w:pPr>
+        <w:spacing w:after="0"/>
+      </w:pPr>
       <w:r>
         <w:t>É o processo de verificação da identidade do usuário ou sistema.</w:t>
       </w:r>
     </w:p>
     <w:p>
+      <w:pPr>
+        <w:spacing w:after="0"/>
+      </w:pPr>
       <w:r>
         <w:rPr>
           <w:b/>
@@ -5422,16 +5606,25 @@
       </w:r>
     </w:p>
     <w:p>
+      <w:pPr>
+        <w:spacing w:after="0"/>
+      </w:pPr>
       <w:r>
         <w:t>É a verificação das permissões disponíveis após a autenticação.</w:t>
       </w:r>
     </w:p>
     <w:p>
+      <w:pPr>
+        <w:spacing w:after="0"/>
+      </w:pPr>
       <w:r>
         <w:t>Foram considerados cenários como:</w:t>
       </w:r>
     </w:p>
     <w:p>
+      <w:pPr>
+        <w:spacing w:after="0"/>
+      </w:pPr>
       <w:r>
         <w:t>• token válido;</w:t>
       </w:r>
@@ -5470,25 +5663,33 @@
     </w:p>
     <w:p>
       <w:pPr>
-        <w:rPr>
-          <w:b/>
-          <w:bCs/>
-        </w:rPr>
-      </w:pPr>
-      <w:r>
-        <w:rPr>
-          <w:b/>
-          <w:bCs/>
-        </w:rPr>
+        <w:spacing w:after="0"/>
+        <w:rPr>
+          <w:b/>
+          <w:bCs/>
+        </w:rPr>
+      </w:pPr>
+      <w:r>
+        <w:rPr>
+          <w:b/>
+          <w:bCs/>
+        </w:rPr>
+        <w:lastRenderedPageBreak/>
         <w:t>3.3 D – Data</w:t>
       </w:r>
     </w:p>
     <w:p>
+      <w:pPr>
+        <w:spacing w:after="0"/>
+      </w:pPr>
       <w:r>
         <w:t>Foram analisados os dados enviados e retornados pela API.</w:t>
       </w:r>
     </w:p>
     <w:p>
+      <w:pPr>
+        <w:spacing w:after="0"/>
+      </w:pPr>
       <w:r>
         <w:t xml:space="preserve">Exemplo de </w:t>
       </w:r>
@@ -5502,11 +5703,17 @@
       </w:r>
     </w:p>
     <w:p>
+      <w:pPr>
+        <w:spacing w:after="0"/>
+      </w:pPr>
       <w:r>
         <w:t>{</w:t>
       </w:r>
     </w:p>
     <w:p>
+      <w:pPr>
+        <w:spacing w:after="0"/>
+      </w:pPr>
       <w:r>
         <w:t xml:space="preserve">  "</w:t>
       </w:r>
@@ -5520,6 +5727,9 @@
       </w:r>
     </w:p>
     <w:p>
+      <w:pPr>
+        <w:spacing w:after="0"/>
+      </w:pPr>
       <w:r>
         <w:t xml:space="preserve">  "</w:t>
       </w:r>
@@ -5533,11 +5743,17 @@
       </w:r>
     </w:p>
     <w:p>
+      <w:pPr>
+        <w:spacing w:after="0"/>
+      </w:pPr>
       <w:r>
         <w:t xml:space="preserve">  "valor": 0,</w:t>
       </w:r>
     </w:p>
     <w:p>
+      <w:pPr>
+        <w:spacing w:after="0"/>
+      </w:pPr>
       <w:r>
         <w:t xml:space="preserve">  "token": "</w:t>
       </w:r>
@@ -5551,16 +5767,25 @@
       </w:r>
     </w:p>
     <w:p>
+      <w:pPr>
+        <w:spacing w:after="0"/>
+      </w:pPr>
       <w:r>
         <w:t>}</w:t>
       </w:r>
     </w:p>
     <w:p>
+      <w:pPr>
+        <w:spacing w:after="0"/>
+      </w:pPr>
       <w:r>
         <w:t>A análise dos dados considerou:</w:t>
       </w:r>
     </w:p>
     <w:p>
+      <w:pPr>
+        <w:spacing w:after="0"/>
+      </w:pPr>
       <w:r>
         <w:t>• campos obrigatórios e opcionais;</w:t>
       </w:r>
@@ -5582,9 +5807,6 @@
       </w:r>
       <w:r>
         <w:br/>
-      </w:r>
-      <w:r>
-        <w:lastRenderedPageBreak/>
         <w:t>• campos vazios ou ausentes;</w:t>
       </w:r>
       <w:r>
@@ -5606,6 +5828,7 @@
     </w:p>
     <w:p>
       <w:pPr>
+        <w:spacing w:after="0"/>
         <w:rPr>
           <w:b/>
           <w:bCs/>
@@ -5629,6 +5852,9 @@
       <w:proofErr w:type="spellEnd"/>
     </w:p>
     <w:p>
+      <w:pPr>
+        <w:spacing w:after="0"/>
+      </w:pPr>
       <w:r>
         <w:t>A validação dos erros considerou os códigos HTTP definidos pelo contrato da API.</w:t>
       </w:r>
@@ -5637,6 +5863,14 @@
       <w:tblPr>
         <w:tblW w:w="0" w:type="auto"/>
         <w:tblCellSpacing w:w="15" w:type="dxa"/>
+        <w:tblBorders>
+          <w:top w:val="single" w:sz="4" w:space="0" w:color="auto"/>
+          <w:left w:val="single" w:sz="4" w:space="0" w:color="auto"/>
+          <w:bottom w:val="single" w:sz="4" w:space="0" w:color="auto"/>
+          <w:right w:val="single" w:sz="4" w:space="0" w:color="auto"/>
+          <w:insideH w:val="single" w:sz="4" w:space="0" w:color="auto"/>
+          <w:insideV w:val="single" w:sz="4" w:space="0" w:color="auto"/>
+        </w:tblBorders>
         <w:tblCellMar>
           <w:top w:w="15" w:type="dxa"/>
           <w:left w:w="15" w:type="dxa"/>
@@ -5646,8 +5880,8 @@
         <w:tblLook w:val="04A0" w:firstRow="1" w:lastRow="0" w:firstColumn="1" w:lastColumn="0" w:noHBand="0" w:noVBand="1"/>
       </w:tblPr>
       <w:tblGrid>
-        <w:gridCol w:w="760"/>
-        <w:gridCol w:w="4619"/>
+        <w:gridCol w:w="780"/>
+        <w:gridCol w:w="4639"/>
       </w:tblGrid>
       <w:tr>
         <w:trPr>
@@ -5661,6 +5895,7 @@
           </w:tcPr>
           <w:p>
             <w:pPr>
+              <w:spacing w:after="0"/>
               <w:rPr>
                 <w:b/>
                 <w:bCs/>
@@ -5683,6 +5918,7 @@
           </w:tcPr>
           <w:p>
             <w:pPr>
+              <w:spacing w:after="0"/>
               <w:rPr>
                 <w:b/>
                 <w:bCs/>
@@ -5709,6 +5945,9 @@
             <w:hideMark/>
           </w:tcPr>
           <w:p>
+            <w:pPr>
+              <w:spacing w:after="0"/>
+            </w:pPr>
             <w:r>
               <w:t>200</w:t>
             </w:r>
@@ -5721,6 +5960,9 @@
             <w:hideMark/>
           </w:tcPr>
           <w:p>
+            <w:pPr>
+              <w:spacing w:after="0"/>
+            </w:pPr>
             <w:r>
               <w:t>Operação realizada com sucesso</w:t>
             </w:r>
@@ -5738,6 +5980,9 @@
             <w:hideMark/>
           </w:tcPr>
           <w:p>
+            <w:pPr>
+              <w:spacing w:after="0"/>
+            </w:pPr>
             <w:r>
               <w:t>201</w:t>
             </w:r>
@@ -5750,6 +5995,9 @@
             <w:hideMark/>
           </w:tcPr>
           <w:p>
+            <w:pPr>
+              <w:spacing w:after="0"/>
+            </w:pPr>
             <w:r>
               <w:t>Recurso criado com sucesso</w:t>
             </w:r>
@@ -5767,6 +6015,9 @@
             <w:hideMark/>
           </w:tcPr>
           <w:p>
+            <w:pPr>
+              <w:spacing w:after="0"/>
+            </w:pPr>
             <w:r>
               <w:t>204</w:t>
             </w:r>
@@ -5779,6 +6030,9 @@
             <w:hideMark/>
           </w:tcPr>
           <w:p>
+            <w:pPr>
+              <w:spacing w:after="0"/>
+            </w:pPr>
             <w:r>
               <w:t>Operação concluída sem conteúdo na resposta</w:t>
             </w:r>
@@ -5796,6 +6050,9 @@
             <w:hideMark/>
           </w:tcPr>
           <w:p>
+            <w:pPr>
+              <w:spacing w:after="0"/>
+            </w:pPr>
             <w:r>
               <w:t>400</w:t>
             </w:r>
@@ -5808,6 +6065,9 @@
             <w:hideMark/>
           </w:tcPr>
           <w:p>
+            <w:pPr>
+              <w:spacing w:after="0"/>
+            </w:pPr>
             <w:r>
               <w:t>Parâmetros inválidos</w:t>
             </w:r>
@@ -5825,6 +6085,9 @@
             <w:hideMark/>
           </w:tcPr>
           <w:p>
+            <w:pPr>
+              <w:spacing w:after="0"/>
+            </w:pPr>
             <w:r>
               <w:t>401</w:t>
             </w:r>
@@ -5837,6 +6100,9 @@
             <w:hideMark/>
           </w:tcPr>
           <w:p>
+            <w:pPr>
+              <w:spacing w:after="0"/>
+            </w:pPr>
             <w:r>
               <w:t>Autenticação necessária ou inválida</w:t>
             </w:r>
@@ -5854,6 +6120,9 @@
             <w:hideMark/>
           </w:tcPr>
           <w:p>
+            <w:pPr>
+              <w:spacing w:after="0"/>
+            </w:pPr>
             <w:r>
               <w:t>403</w:t>
             </w:r>
@@ -5866,6 +6135,9 @@
             <w:hideMark/>
           </w:tcPr>
           <w:p>
+            <w:pPr>
+              <w:spacing w:after="0"/>
+            </w:pPr>
             <w:r>
               <w:t>Acesso não permitido</w:t>
             </w:r>
@@ -5883,6 +6155,9 @@
             <w:hideMark/>
           </w:tcPr>
           <w:p>
+            <w:pPr>
+              <w:spacing w:after="0"/>
+            </w:pPr>
             <w:r>
               <w:t>405</w:t>
             </w:r>
@@ -5895,6 +6170,9 @@
             <w:hideMark/>
           </w:tcPr>
           <w:p>
+            <w:pPr>
+              <w:spacing w:after="0"/>
+            </w:pPr>
             <w:r>
               <w:t>Método não permitido</w:t>
             </w:r>
@@ -5912,6 +6190,9 @@
             <w:hideMark/>
           </w:tcPr>
           <w:p>
+            <w:pPr>
+              <w:spacing w:after="0"/>
+            </w:pPr>
             <w:r>
               <w:t>422</w:t>
             </w:r>
@@ -5924,6 +6205,9 @@
             <w:hideMark/>
           </w:tcPr>
           <w:p>
+            <w:pPr>
+              <w:spacing w:after="0"/>
+            </w:pPr>
             <w:r>
               <w:t>Erro de validação dos dados</w:t>
             </w:r>
@@ -5941,6 +6225,9 @@
             <w:hideMark/>
           </w:tcPr>
           <w:p>
+            <w:pPr>
+              <w:spacing w:after="0"/>
+            </w:pPr>
             <w:r>
               <w:t>500</w:t>
             </w:r>
@@ -5953,6 +6240,9 @@
             <w:hideMark/>
           </w:tcPr>
           <w:p>
+            <w:pPr>
+              <w:spacing w:after="0"/>
+            </w:pPr>
             <w:r>
               <w:t>Erro interno do servidor</w:t>
             </w:r>
@@ -5961,26 +6251,41 @@
       </w:tr>
     </w:tbl>
     <w:p>
+      <w:pPr>
+        <w:spacing w:after="0"/>
+      </w:pPr>
       <w:r>
         <w:t>Os códigos efetivamente esperados devem estar de acordo com o contrato da API.</w:t>
       </w:r>
     </w:p>
     <w:p>
+      <w:pPr>
+        <w:spacing w:after="0"/>
+      </w:pPr>
       <w:r>
         <w:t>Também foi considerada a validação do corpo das respostas de erro, incluindo mensagens, estrutura dos dados e ausência de informações internas ou sensíveis.</w:t>
       </w:r>
     </w:p>
     <w:p>
+      <w:pPr>
+        <w:spacing w:after="0"/>
+      </w:pPr>
       <w:r>
         <w:t>Exemplo:</w:t>
       </w:r>
     </w:p>
     <w:p>
+      <w:pPr>
+        <w:spacing w:after="0"/>
+      </w:pPr>
       <w:r>
         <w:t>{</w:t>
       </w:r>
     </w:p>
     <w:p>
+      <w:pPr>
+        <w:spacing w:after="0"/>
+      </w:pPr>
       <w:r>
         <w:t xml:space="preserve">  "</w:t>
       </w:r>
@@ -5994,12 +6299,16 @@
       </w:r>
     </w:p>
     <w:p>
+      <w:pPr>
+        <w:spacing w:after="0"/>
+      </w:pPr>
       <w:r>
         <w:t>}</w:t>
       </w:r>
     </w:p>
     <w:p>
       <w:pPr>
+        <w:spacing w:after="0"/>
         <w:rPr>
           <w:b/>
           <w:bCs/>
@@ -6023,16 +6332,26 @@
       <w:proofErr w:type="spellEnd"/>
     </w:p>
     <w:p>
+      <w:pPr>
+        <w:spacing w:after="0"/>
+      </w:pPr>
       <w:r>
         <w:t>A análise de responsividade considerou o tempo necessário para que a aplicação respondesse às requisições.</w:t>
       </w:r>
     </w:p>
     <w:p>
-      <w:r>
+      <w:pPr>
+        <w:spacing w:after="0"/>
+      </w:pPr>
+      <w:r>
+        <w:lastRenderedPageBreak/>
         <w:t>O requisito analisado para o login estabeleceu tempo de resposta inferior a 50 milissegundos com 10 usuários conectados e enviando requisições durante 1 minuto.</w:t>
       </w:r>
     </w:p>
     <w:p>
+      <w:pPr>
+        <w:spacing w:after="0"/>
+      </w:pPr>
       <w:r>
         <w:t xml:space="preserve">Para essa validação, foi considerada a necessidade de execução de testes de performance utilizando o </w:t>
       </w:r>
@@ -6046,13 +6365,18 @@
       </w:r>
     </w:p>
     <w:p>
+      <w:pPr>
+        <w:spacing w:after="0"/>
+      </w:pPr>
       <w:r>
         <w:t>Também foram considerados:</w:t>
       </w:r>
     </w:p>
     <w:p>
-      <w:r>
-        <w:lastRenderedPageBreak/>
+      <w:pPr>
+        <w:spacing w:after="0"/>
+      </w:pPr>
+      <w:r>
         <w:t>• tempo de resposta;</w:t>
       </w:r>
       <w:r>
@@ -6088,14 +6412,18 @@
       </w:r>
     </w:p>
     <w:p>
+      <w:pPr>
+        <w:spacing w:after="0"/>
+      </w:pPr>
       <w:r>
         <w:pict w14:anchorId="51012424">
-          <v:rect id="_x0000_i1184" style="width:0;height:1.5pt" o:hralign="center" o:hrstd="t" o:hr="t" fillcolor="#a0a0a0" stroked="f"/>
+          <v:rect id="_x0000_i1031" style="width:0;height:1.5pt" o:hralign="center" o:hrstd="t" o:hr="t" fillcolor="#a0a0a0" stroked="f"/>
         </w:pict>
       </w:r>
     </w:p>
     <w:p>
       <w:pPr>
+        <w:spacing w:after="0"/>
         <w:rPr>
           <w:b/>
           <w:bCs/>
@@ -6110,11 +6438,17 @@
       </w:r>
     </w:p>
     <w:p>
+      <w:pPr>
+        <w:spacing w:after="0"/>
+      </w:pPr>
       <w:r>
         <w:t>Durante a análise da API, foram considerados alguns comportamentos que podem indicar problemas de implementação ou validação.</w:t>
       </w:r>
     </w:p>
     <w:p>
+      <w:pPr>
+        <w:spacing w:after="0"/>
+      </w:pPr>
       <w:r>
         <w:rPr>
           <w:b/>
@@ -6124,11 +6458,17 @@
       </w:r>
     </w:p>
     <w:p>
+      <w:pPr>
+        <w:spacing w:after="0"/>
+      </w:pPr>
       <w:r>
         <w:t>Exemplos:</w:t>
       </w:r>
     </w:p>
     <w:p>
+      <w:pPr>
+        <w:spacing w:after="0"/>
+      </w:pPr>
       <w:r>
         <w:t>• utilização de GET para excluir recursos;</w:t>
       </w:r>
@@ -6138,6 +6478,9 @@
       </w:r>
     </w:p>
     <w:p>
+      <w:pPr>
+        <w:spacing w:after="0"/>
+      </w:pPr>
       <w:r>
         <w:rPr>
           <w:b/>
@@ -6147,11 +6490,17 @@
       </w:r>
     </w:p>
     <w:p>
+      <w:pPr>
+        <w:spacing w:after="0"/>
+      </w:pPr>
       <w:r>
         <w:t>Exemplos:</w:t>
       </w:r>
     </w:p>
     <w:p>
+      <w:pPr>
+        <w:spacing w:after="0"/>
+      </w:pPr>
       <w:r>
         <w:t>• acesso a recursos protegidos sem token;</w:t>
       </w:r>
@@ -6161,6 +6510,9 @@
       </w:r>
     </w:p>
     <w:p>
+      <w:pPr>
+        <w:spacing w:after="0"/>
+      </w:pPr>
       <w:r>
         <w:rPr>
           <w:b/>
@@ -6170,11 +6522,17 @@
       </w:r>
     </w:p>
     <w:p>
+      <w:pPr>
+        <w:spacing w:after="0"/>
+      </w:pPr>
       <w:r>
         <w:t>Dados inválidos ou incompletos podem ser aceitos sem o tratamento adequado.</w:t>
       </w:r>
     </w:p>
     <w:p>
+      <w:pPr>
+        <w:spacing w:after="0"/>
+      </w:pPr>
       <w:r>
         <w:rPr>
           <w:b/>
@@ -6184,21 +6542,33 @@
       </w:r>
     </w:p>
     <w:p>
+      <w:pPr>
+        <w:spacing w:after="0"/>
+      </w:pPr>
       <w:r>
         <w:t>Exemplo:</w:t>
       </w:r>
     </w:p>
     <w:p>
+      <w:pPr>
+        <w:spacing w:after="0"/>
+      </w:pPr>
       <w:r>
         <w:t>"Algo deu errado"</w:t>
       </w:r>
     </w:p>
     <w:p>
+      <w:pPr>
+        <w:spacing w:after="0"/>
+      </w:pPr>
       <w:r>
         <w:t>Também foi considerada a utilização inadequada de códigos HTTP, como retornar 200 para uma operação que apresentou falha.</w:t>
       </w:r>
     </w:p>
     <w:p>
+      <w:pPr>
+        <w:spacing w:after="0"/>
+      </w:pPr>
       <w:r>
         <w:rPr>
           <w:b/>
@@ -6208,6 +6578,9 @@
       </w:r>
     </w:p>
     <w:p>
+      <w:pPr>
+        <w:spacing w:after="0"/>
+      </w:pPr>
       <w:r>
         <w:t xml:space="preserve">Foi considerada a necessidade de evitar a exposição de informações internas, como </w:t>
       </w:r>
@@ -6221,6 +6594,9 @@
       </w:r>
     </w:p>
     <w:p>
+      <w:pPr>
+        <w:spacing w:after="0"/>
+      </w:pPr>
       <w:r>
         <w:rPr>
           <w:b/>
@@ -6230,19 +6606,26 @@
       </w:r>
     </w:p>
     <w:p>
+      <w:pPr>
+        <w:spacing w:after="0"/>
+      </w:pPr>
       <w:r>
         <w:t>Foram considerados tempos de resposta elevados ou inconsistentes, principalmente em situações de carga e concorrência.</w:t>
       </w:r>
     </w:p>
     <w:p>
+      <w:pPr>
+        <w:spacing w:after="0"/>
+      </w:pPr>
       <w:r>
         <w:pict w14:anchorId="33D46B58">
-          <v:rect id="_x0000_i1185" style="width:0;height:1.5pt" o:hralign="center" o:hrstd="t" o:hr="t" fillcolor="#a0a0a0" stroked="f"/>
+          <v:rect id="_x0000_i1032" style="width:0;height:1.5pt" o:hralign="center" o:hrstd="t" o:hr="t" fillcolor="#a0a0a0" stroked="f"/>
         </w:pict>
       </w:r>
     </w:p>
     <w:p>
       <w:pPr>
+        <w:spacing w:after="0"/>
         <w:rPr>
           <w:b/>
           <w:bCs/>
@@ -6257,11 +6640,17 @@
       </w:r>
     </w:p>
     <w:p>
+      <w:pPr>
+        <w:spacing w:after="0"/>
+      </w:pPr>
       <w:r>
         <w:t>A heurística VADER foi utilizada como referência para identificar os cenários que deveriam ser contemplados na automação.</w:t>
       </w:r>
     </w:p>
     <w:p>
+      <w:pPr>
+        <w:spacing w:after="0"/>
+      </w:pPr>
       <w:r>
         <w:t xml:space="preserve">Antes da criação dos testes automatizados, os </w:t>
       </w:r>
@@ -6275,228 +6664,316 @@
       </w:r>
     </w:p>
     <w:p>
-      <w:r>
-        <w:rPr>
-          <w:b/>
-          <w:bCs/>
-        </w:rPr>
+      <w:pPr>
+        <w:spacing w:after="0"/>
+      </w:pPr>
+      <w:r>
+        <w:rPr>
+          <w:b/>
+          <w:bCs/>
+        </w:rPr>
+        <w:t xml:space="preserve">V – </w:t>
+      </w:r>
+      <w:proofErr w:type="spellStart"/>
+      <w:r>
+        <w:rPr>
+          <w:b/>
+          <w:bCs/>
+        </w:rPr>
+        <w:t>Verbs</w:t>
+      </w:r>
+      <w:proofErr w:type="spellEnd"/>
+      <w:r>
+        <w:rPr>
+          <w:b/>
+          <w:bCs/>
+        </w:rPr>
+        <w:t xml:space="preserve">: </w:t>
+      </w:r>
+      <w:r>
+        <w:t>Validação dos métodos HTTP e do comportamento esperado.</w:t>
+      </w:r>
+    </w:p>
+    <w:p>
+      <w:pPr>
+        <w:spacing w:after="0"/>
+      </w:pPr>
+      <w:r>
+        <w:rPr>
+          <w:b/>
+          <w:bCs/>
+        </w:rPr>
+        <w:t xml:space="preserve">A – </w:t>
+      </w:r>
+      <w:proofErr w:type="spellStart"/>
+      <w:r>
+        <w:rPr>
+          <w:b/>
+          <w:bCs/>
+        </w:rPr>
+        <w:t>Authorization</w:t>
+      </w:r>
+      <w:proofErr w:type="spellEnd"/>
+      <w:r>
+        <w:rPr>
+          <w:b/>
+          <w:bCs/>
+        </w:rPr>
+        <w:t xml:space="preserve">: </w:t>
+      </w:r>
+      <w:r>
+        <w:t>Validação de autenticação, tokens e permissões.</w:t>
+      </w:r>
+    </w:p>
+    <w:p>
+      <w:pPr>
+        <w:spacing w:after="0"/>
+      </w:pPr>
+      <w:r>
+        <w:rPr>
+          <w:b/>
+          <w:bCs/>
+        </w:rPr>
+        <w:t>D – Data</w:t>
+      </w:r>
+      <w:r>
+        <w:rPr>
+          <w:b/>
+          <w:bCs/>
+        </w:rPr>
+        <w:t xml:space="preserve">: </w:t>
+      </w:r>
+      <w:r>
+        <w:t>Validação dos dados enviados e recebidos.</w:t>
+      </w:r>
+    </w:p>
+    <w:p>
+      <w:pPr>
+        <w:spacing w:after="0"/>
+      </w:pPr>
+      <w:r>
+        <w:rPr>
+          <w:b/>
+          <w:bCs/>
+        </w:rPr>
+        <w:t xml:space="preserve">E – </w:t>
+      </w:r>
+      <w:proofErr w:type="spellStart"/>
+      <w:r>
+        <w:rPr>
+          <w:b/>
+          <w:bCs/>
+        </w:rPr>
+        <w:t>Errors</w:t>
+      </w:r>
+      <w:proofErr w:type="spellEnd"/>
+      <w:r>
+        <w:rPr>
+          <w:b/>
+          <w:bCs/>
+        </w:rPr>
+        <w:t xml:space="preserve">: </w:t>
+      </w:r>
+      <w:r>
+        <w:t>Validação dos códigos HTTP e mensagens de erro.</w:t>
+      </w:r>
+    </w:p>
+    <w:p>
+      <w:pPr>
+        <w:spacing w:after="0"/>
+      </w:pPr>
+      <w:r>
+        <w:rPr>
+          <w:b/>
+          <w:bCs/>
+        </w:rPr>
+        <w:t xml:space="preserve">R – </w:t>
+      </w:r>
+      <w:proofErr w:type="spellStart"/>
+      <w:r>
+        <w:rPr>
+          <w:b/>
+          <w:bCs/>
+        </w:rPr>
+        <w:t>Responsiveness</w:t>
+      </w:r>
+      <w:proofErr w:type="spellEnd"/>
+      <w:r>
+        <w:rPr>
+          <w:b/>
+          <w:bCs/>
+        </w:rPr>
+        <w:t xml:space="preserve">: </w:t>
+      </w:r>
+      <w:r>
+        <w:t>Avaliação do comportamento da API em relação ao tempo de resposta, timeout e concorrência.</w:t>
+      </w:r>
+    </w:p>
+    <w:p>
+      <w:pPr>
+        <w:spacing w:after="0"/>
+      </w:pPr>
+      <w:r>
         <w:lastRenderedPageBreak/>
-        <w:t xml:space="preserve">V – </w:t>
-      </w:r>
-      <w:proofErr w:type="spellStart"/>
-      <w:r>
-        <w:rPr>
-          <w:b/>
-          <w:bCs/>
-        </w:rPr>
-        <w:t>Verbs</w:t>
-      </w:r>
-      <w:proofErr w:type="spellEnd"/>
+        <w:t>Dessa forma, a VADER foi utilizada como guia de investigação e organização dos cenários de teste.</w:t>
+      </w:r>
+    </w:p>
+    <w:p>
+      <w:pPr>
+        <w:spacing w:after="0"/>
+      </w:pPr>
+      <w:r>
+        <w:pict w14:anchorId="7726E8E1">
+          <v:rect id="_x0000_i1033" style="width:0;height:1.5pt" o:hralign="center" o:hrstd="t" o:hr="t" fillcolor="#a0a0a0" stroked="f"/>
+        </w:pict>
+      </w:r>
+    </w:p>
+    <w:p>
+      <w:pPr>
+        <w:spacing w:after="0"/>
+        <w:rPr>
+          <w:b/>
+          <w:bCs/>
+        </w:rPr>
+      </w:pPr>
+      <w:r>
+        <w:rPr>
+          <w:b/>
+          <w:bCs/>
+        </w:rPr>
+        <w:t>6. AUTOMAÇÃO DE API REST</w:t>
+      </w:r>
+    </w:p>
+    <w:p>
+      <w:pPr>
+        <w:spacing w:after="0"/>
+      </w:pPr>
+      <w:r>
+        <w:t>A automação dos testes foi estruturada utilizando as seguintes bibliotecas:</w:t>
+      </w:r>
+    </w:p>
+    <w:p>
+      <w:pPr>
+        <w:spacing w:after="0"/>
+      </w:pPr>
+      <w:r>
+        <w:rPr>
+          <w:b/>
+          <w:bCs/>
+        </w:rPr>
+        <w:t>Mocha</w:t>
+      </w:r>
+      <w:r>
+        <w:rPr>
+          <w:b/>
+          <w:bCs/>
+        </w:rPr>
+        <w:t xml:space="preserve">: </w:t>
+      </w:r>
+      <w:r>
+        <w:t>Framework utilizado para organização e execução dos testes.</w:t>
+      </w:r>
+    </w:p>
+    <w:p>
+      <w:pPr>
+        <w:spacing w:after="0"/>
+      </w:pPr>
+      <w:proofErr w:type="spellStart"/>
+      <w:r>
+        <w:rPr>
+          <w:b/>
+          <w:bCs/>
+        </w:rPr>
+        <w:t>SuperTest</w:t>
+      </w:r>
+      <w:proofErr w:type="spellEnd"/>
+      <w:r>
+        <w:rPr>
+          <w:b/>
+          <w:bCs/>
+        </w:rPr>
+        <w:t xml:space="preserve">: </w:t>
+      </w:r>
+      <w:r>
+        <w:t xml:space="preserve">Biblioteca utilizada para realizar requisições HTTP e testar </w:t>
+      </w:r>
+      <w:proofErr w:type="spellStart"/>
+      <w:r>
+        <w:t>endpoints</w:t>
+      </w:r>
+      <w:proofErr w:type="spellEnd"/>
+      <w:r>
+        <w:t>.</w:t>
+      </w:r>
+    </w:p>
+    <w:p>
+      <w:pPr>
+        <w:spacing w:after="0"/>
+      </w:pPr>
+      <w:r>
+        <w:rPr>
+          <w:b/>
+          <w:bCs/>
+        </w:rPr>
+        <w:t>Chai</w:t>
+      </w:r>
+      <w:r>
+        <w:rPr>
+          <w:b/>
+          <w:bCs/>
+        </w:rPr>
+        <w:t xml:space="preserve">: </w:t>
+      </w:r>
+      <w:r>
+        <w:t>Biblioteca utilizada para realizar as asserções dos resultados obtidos.</w:t>
+      </w:r>
+    </w:p>
+    <w:p>
+      <w:pPr>
+        <w:spacing w:after="0"/>
+      </w:pPr>
+      <w:r>
+        <w:t>A estrutura utilizada relacionou as ferramentas da seguinte forma:</w:t>
+      </w:r>
+    </w:p>
+    <w:p>
+      <w:pPr>
+        <w:spacing w:after="0"/>
+      </w:pPr>
+      <w:r>
+        <w:rPr>
+          <w:b/>
+          <w:bCs/>
+        </w:rPr>
+        <w:t>Mocha →</w:t>
+      </w:r>
+      <w:r>
+        <w:t xml:space="preserve"> organização e execução dos testes</w:t>
+      </w:r>
       <w:r>
         <w:br/>
-        <w:t>Validação dos métodos HTTP e do comportamento esperado.</w:t>
-      </w:r>
-    </w:p>
-    <w:p>
-      <w:r>
-        <w:rPr>
-          <w:b/>
-          <w:bCs/>
-        </w:rPr>
-        <w:t xml:space="preserve">A – </w:t>
-      </w:r>
-      <w:proofErr w:type="spellStart"/>
-      <w:r>
-        <w:rPr>
-          <w:b/>
-          <w:bCs/>
-        </w:rPr>
-        <w:t>Authorization</w:t>
-      </w:r>
-      <w:proofErr w:type="spellEnd"/>
+      </w:r>
+      <w:proofErr w:type="spellStart"/>
+      <w:r>
+        <w:rPr>
+          <w:b/>
+          <w:bCs/>
+        </w:rPr>
+        <w:t>SuperTest</w:t>
+      </w:r>
+      <w:proofErr w:type="spellEnd"/>
+      <w:r>
+        <w:rPr>
+          <w:b/>
+          <w:bCs/>
+        </w:rPr>
+        <w:t xml:space="preserve"> →</w:t>
+      </w:r>
+      <w:r>
+        <w:t xml:space="preserve"> requisições HTTP</w:t>
+      </w:r>
       <w:r>
         <w:br/>
-        <w:t>Validação de autenticação, tokens e permissões.</w:t>
-      </w:r>
-    </w:p>
-    <w:p>
-      <w:r>
-        <w:rPr>
-          <w:b/>
-          <w:bCs/>
-        </w:rPr>
-        <w:t>D – Data</w:t>
-      </w:r>
-      <w:r>
-        <w:br/>
-        <w:t>Validação dos dados enviados e recebidos.</w:t>
-      </w:r>
-    </w:p>
-    <w:p>
-      <w:r>
-        <w:rPr>
-          <w:b/>
-          <w:bCs/>
-        </w:rPr>
-        <w:t xml:space="preserve">E – </w:t>
-      </w:r>
-      <w:proofErr w:type="spellStart"/>
-      <w:r>
-        <w:rPr>
-          <w:b/>
-          <w:bCs/>
-        </w:rPr>
-        <w:t>Errors</w:t>
-      </w:r>
-      <w:proofErr w:type="spellEnd"/>
-      <w:r>
-        <w:br/>
-        <w:t>Validação dos códigos HTTP e mensagens de erro.</w:t>
-      </w:r>
-    </w:p>
-    <w:p>
-      <w:r>
-        <w:rPr>
-          <w:b/>
-          <w:bCs/>
-        </w:rPr>
-        <w:t xml:space="preserve">R – </w:t>
-      </w:r>
-      <w:proofErr w:type="spellStart"/>
-      <w:r>
-        <w:rPr>
-          <w:b/>
-          <w:bCs/>
-        </w:rPr>
-        <w:t>Responsiveness</w:t>
-      </w:r>
-      <w:proofErr w:type="spellEnd"/>
-      <w:r>
-        <w:br/>
-        <w:t>Avaliação do comportamento da API em relação ao tempo de resposta, timeout e concorrência.</w:t>
-      </w:r>
-    </w:p>
-    <w:p>
-      <w:r>
-        <w:t>Dessa forma, a VADER foi utilizada como guia de investigação e organização dos cenários de teste.</w:t>
-      </w:r>
-    </w:p>
-    <w:p>
-      <w:r>
-        <w:pict w14:anchorId="7726E8E1">
-          <v:rect id="_x0000_i1186" style="width:0;height:1.5pt" o:hralign="center" o:hrstd="t" o:hr="t" fillcolor="#a0a0a0" stroked="f"/>
-        </w:pict>
-      </w:r>
-    </w:p>
-    <w:p>
-      <w:pPr>
-        <w:rPr>
-          <w:b/>
-          <w:bCs/>
-        </w:rPr>
-      </w:pPr>
-      <w:r>
-        <w:rPr>
-          <w:b/>
-          <w:bCs/>
-        </w:rPr>
-        <w:t>6. AUTOMAÇÃO DE API REST</w:t>
-      </w:r>
-    </w:p>
-    <w:p>
-      <w:r>
-        <w:t>A automação dos testes foi estruturada utilizando as seguintes bibliotecas:</w:t>
-      </w:r>
-    </w:p>
-    <w:p>
-      <w:r>
-        <w:rPr>
-          <w:b/>
-          <w:bCs/>
-        </w:rPr>
-        <w:t>Mocha</w:t>
-      </w:r>
-      <w:r>
-        <w:br/>
-        <w:t>Framework utilizado para organização e execução dos testes.</w:t>
-      </w:r>
-    </w:p>
-    <w:p>
-      <w:proofErr w:type="spellStart"/>
-      <w:r>
-        <w:rPr>
-          <w:b/>
-          <w:bCs/>
-        </w:rPr>
-        <w:t>SuperTest</w:t>
-      </w:r>
-      <w:proofErr w:type="spellEnd"/>
-      <w:r>
-        <w:br/>
-        <w:t xml:space="preserve">Biblioteca utilizada para realizar requisições HTTP e testar </w:t>
-      </w:r>
-      <w:proofErr w:type="spellStart"/>
-      <w:r>
-        <w:t>endpoints</w:t>
-      </w:r>
-      <w:proofErr w:type="spellEnd"/>
-      <w:r>
-        <w:t>.</w:t>
-      </w:r>
-    </w:p>
-    <w:p>
-      <w:r>
-        <w:rPr>
-          <w:b/>
-          <w:bCs/>
-        </w:rPr>
-        <w:t>Chai</w:t>
-      </w:r>
-      <w:r>
-        <w:br/>
-        <w:t>Biblioteca utilizada para realizar as asserções dos resultados obtidos.</w:t>
-      </w:r>
-    </w:p>
-    <w:p>
-      <w:r>
-        <w:t>A estrutura utilizada relacionou as ferramentas da seguinte forma:</w:t>
-      </w:r>
-    </w:p>
-    <w:p>
-      <w:r>
-        <w:rPr>
-          <w:b/>
-          <w:bCs/>
-        </w:rPr>
-        <w:t>Mocha →</w:t>
-      </w:r>
-      <w:r>
-        <w:t xml:space="preserve"> organização e execução dos testes</w:t>
-      </w:r>
-      <w:r>
-        <w:br/>
-      </w:r>
-      <w:proofErr w:type="spellStart"/>
-      <w:r>
-        <w:rPr>
-          <w:b/>
-          <w:bCs/>
-        </w:rPr>
-        <w:t>SuperTest</w:t>
-      </w:r>
-      <w:proofErr w:type="spellEnd"/>
-      <w:r>
-        <w:rPr>
-          <w:b/>
-          <w:bCs/>
-        </w:rPr>
-        <w:t xml:space="preserve"> →</w:t>
-      </w:r>
-      <w:r>
-        <w:t xml:space="preserve"> requisições HTTP</w:t>
-      </w:r>
-      <w:r>
-        <w:br/>
       </w:r>
       <w:r>
         <w:rPr>
@@ -6511,6 +6988,7 @@
     </w:p>
     <w:p>
       <w:pPr>
+        <w:spacing w:after="0"/>
         <w:rPr>
           <w:b/>
           <w:bCs/>
@@ -6525,11 +7003,17 @@
       </w:r>
     </w:p>
     <w:p>
+      <w:pPr>
+        <w:spacing w:after="0"/>
+      </w:pPr>
       <w:r>
         <w:t>A estrutura do projeto foi organizada da seguinte maneira:</w:t>
       </w:r>
     </w:p>
     <w:p>
+      <w:pPr>
+        <w:spacing w:after="0"/>
+      </w:pPr>
       <w:r>
         <w:t>banco-api-</w:t>
       </w:r>
@@ -6540,6 +7024,9 @@
       <w:proofErr w:type="spellEnd"/>
     </w:p>
     <w:p>
+      <w:pPr>
+        <w:spacing w:after="0"/>
+      </w:pPr>
       <w:r>
         <w:t xml:space="preserve">└── </w:t>
       </w:r>
@@ -6555,6 +7042,7 @@
     </w:p>
     <w:p>
       <w:pPr>
+        <w:spacing w:after="0"/>
         <w:rPr>
           <w:b/>
           <w:bCs/>
@@ -6569,6 +7057,9 @@
       </w:r>
     </w:p>
     <w:p>
+      <w:pPr>
+        <w:spacing w:after="0"/>
+      </w:pPr>
       <w:r>
         <w:t xml:space="preserve">O projeto foi inicializado pelo </w:t>
       </w:r>
@@ -6590,6 +7081,9 @@
       </w:r>
     </w:p>
     <w:p>
+      <w:pPr>
+        <w:spacing w:after="0"/>
+      </w:pPr>
       <w:proofErr w:type="spellStart"/>
       <w:r>
         <w:t>npm</w:t>
@@ -6608,11 +7102,17 @@
       </w:r>
     </w:p>
     <w:p>
+      <w:pPr>
+        <w:spacing w:after="0"/>
+      </w:pPr>
       <w:r>
         <w:t>As bibliotecas necessárias foram instaladas com:</w:t>
       </w:r>
     </w:p>
     <w:p>
+      <w:pPr>
+        <w:spacing w:after="0"/>
+      </w:pPr>
       <w:proofErr w:type="spellStart"/>
       <w:r>
         <w:t>npm</w:t>
@@ -6645,31 +7145,1665 @@
     </w:p>
     <w:p>
       <w:pPr>
-        <w:rPr>
-          <w:b/>
-          <w:bCs/>
-        </w:rPr>
-      </w:pPr>
-      <w:r>
-        <w:rPr>
-          <w:b/>
-          <w:bCs/>
-        </w:rPr>
+        <w:spacing w:after="0"/>
+        <w:rPr>
+          <w:b/>
+          <w:bCs/>
+        </w:rPr>
+      </w:pPr>
+      <w:r>
+        <w:rPr>
+          <w:b/>
+          <w:bCs/>
+        </w:rPr>
+        <w:t>6.3 Script de teste de Login</w:t>
+      </w:r>
+    </w:p>
+    <w:p>
+      <w:pPr>
+        <w:spacing w:after="0"/>
+      </w:pPr>
+      <w:r>
+        <w:t xml:space="preserve">Foi estruturado o primeiro script de teste para o </w:t>
+      </w:r>
+      <w:proofErr w:type="spellStart"/>
+      <w:r>
+        <w:t>endpoint</w:t>
+      </w:r>
+      <w:proofErr w:type="spellEnd"/>
+      <w:r>
+        <w:t xml:space="preserve"> de login da API, utilizando Mocha, </w:t>
+      </w:r>
+      <w:proofErr w:type="spellStart"/>
+      <w:r>
+        <w:t>SuperTest</w:t>
+      </w:r>
+      <w:proofErr w:type="spellEnd"/>
+      <w:r>
+        <w:t xml:space="preserve"> e Chai.</w:t>
+      </w:r>
+    </w:p>
+    <w:p>
+      <w:pPr>
+        <w:spacing w:after="0"/>
+        <w:rPr>
+          <w:b/>
+          <w:bCs/>
+        </w:rPr>
+      </w:pPr>
+      <w:r>
+        <w:rPr>
+          <w:b/>
+          <w:bCs/>
+        </w:rPr>
+        <w:t>6.4 Execução dos testes</w:t>
+      </w:r>
+    </w:p>
+    <w:p>
+      <w:pPr>
+        <w:spacing w:after="0"/>
+      </w:pPr>
+      <w:r>
+        <w:t xml:space="preserve">O Mocha foi configurado no </w:t>
+      </w:r>
+      <w:proofErr w:type="spellStart"/>
+      <w:r>
+        <w:t>package.json</w:t>
+      </w:r>
+      <w:proofErr w:type="spellEnd"/>
+      <w:r>
+        <w:t xml:space="preserve"> para localizar os arquivos de teste:</w:t>
+      </w:r>
+    </w:p>
+    <w:p>
+      <w:pPr>
+        <w:spacing w:after="0"/>
+      </w:pPr>
+      <w:r>
+        <w:t>"scripts": {</w:t>
+      </w:r>
+    </w:p>
+    <w:p>
+      <w:pPr>
+        <w:spacing w:after="0"/>
+      </w:pPr>
+      <w:r>
+        <w:t xml:space="preserve">  "</w:t>
+      </w:r>
+      <w:proofErr w:type="spellStart"/>
+      <w:r>
+        <w:t>test</w:t>
+      </w:r>
+      <w:proofErr w:type="spellEnd"/>
+      <w:r>
+        <w:t>": "mocha ./</w:t>
+      </w:r>
+      <w:proofErr w:type="spellStart"/>
+      <w:r>
+        <w:t>test</w:t>
+      </w:r>
+      <w:proofErr w:type="spellEnd"/>
+      <w:r>
+        <w:t>/**/*.test.js --timeout=200000"</w:t>
+      </w:r>
+    </w:p>
+    <w:p>
+      <w:pPr>
+        <w:spacing w:after="0"/>
+      </w:pPr>
+      <w:r>
+        <w:t>}</w:t>
+      </w:r>
+    </w:p>
+    <w:p>
+      <w:pPr>
+        <w:spacing w:after="0"/>
+      </w:pPr>
+      <w:r>
+        <w:t>A execução da suíte foi realizada pelo comando:</w:t>
+      </w:r>
+    </w:p>
+    <w:p>
+      <w:pPr>
+        <w:spacing w:after="0"/>
+      </w:pPr>
+      <w:proofErr w:type="spellStart"/>
+      <w:r>
+        <w:t>npm</w:t>
+      </w:r>
+      <w:proofErr w:type="spellEnd"/>
+      <w:r>
+        <w:t xml:space="preserve"> </w:t>
+      </w:r>
+      <w:proofErr w:type="spellStart"/>
+      <w:r>
+        <w:t>test</w:t>
+      </w:r>
+      <w:proofErr w:type="spellEnd"/>
+    </w:p>
+    <w:p>
+      <w:pPr>
+        <w:spacing w:after="0"/>
+      </w:pPr>
+      <w:r>
+        <w:pict w14:anchorId="2AC0FEBE">
+          <v:rect id="_x0000_i1034" style="width:0;height:1.5pt" o:hralign="center" o:hrstd="t" o:hr="t" fillcolor="#a0a0a0" stroked="f"/>
+        </w:pict>
+      </w:r>
+    </w:p>
+    <w:p>
+      <w:pPr>
+        <w:spacing w:after="0"/>
+        <w:rPr>
+          <w:b/>
+          <w:bCs/>
+        </w:rPr>
+      </w:pPr>
+      <w:r>
+        <w:rPr>
+          <w:b/>
+          <w:bCs/>
+        </w:rPr>
+        <w:t>7. GERAÇÃO DE RELATÓRIOS</w:t>
+      </w:r>
+    </w:p>
+    <w:p>
+      <w:pPr>
+        <w:spacing w:after="0"/>
+      </w:pPr>
+      <w:r>
+        <w:t xml:space="preserve">Foi utilizada a biblioteca </w:t>
+      </w:r>
+      <w:proofErr w:type="spellStart"/>
+      <w:r>
+        <w:rPr>
+          <w:b/>
+          <w:bCs/>
+        </w:rPr>
+        <w:t>Mochawesome</w:t>
+      </w:r>
+      <w:proofErr w:type="spellEnd"/>
+      <w:r>
+        <w:t xml:space="preserve"> para geração dos relatórios de execução dos testes.</w:t>
+      </w:r>
+    </w:p>
+    <w:p>
+      <w:pPr>
+        <w:spacing w:after="0"/>
+      </w:pPr>
+      <w:r>
+        <w:t>Instalação:</w:t>
+      </w:r>
+    </w:p>
+    <w:p>
+      <w:pPr>
+        <w:spacing w:after="0"/>
+      </w:pPr>
+      <w:proofErr w:type="spellStart"/>
+      <w:r>
+        <w:t>npm</w:t>
+      </w:r>
+      <w:proofErr w:type="spellEnd"/>
+      <w:r>
+        <w:t xml:space="preserve"> </w:t>
+      </w:r>
+      <w:proofErr w:type="spellStart"/>
+      <w:r>
+        <w:t>install</w:t>
+      </w:r>
+      <w:proofErr w:type="spellEnd"/>
+      <w:r>
+        <w:t xml:space="preserve"> -D </w:t>
+      </w:r>
+      <w:proofErr w:type="spellStart"/>
+      <w:r>
+        <w:t>mochawesome</w:t>
+      </w:r>
+      <w:proofErr w:type="spellEnd"/>
+    </w:p>
+    <w:p>
+      <w:pPr>
+        <w:spacing w:after="0"/>
+      </w:pPr>
+      <w:r>
+        <w:t xml:space="preserve">O script de execução foi configurado com o </w:t>
+      </w:r>
+      <w:proofErr w:type="spellStart"/>
+      <w:r>
+        <w:t>reporter</w:t>
+      </w:r>
+      <w:proofErr w:type="spellEnd"/>
+      <w:r>
+        <w:t>:</w:t>
+      </w:r>
+    </w:p>
+    <w:p>
+      <w:pPr>
+        <w:spacing w:after="0"/>
+      </w:pPr>
+      <w:r>
+        <w:t>"scripts": {</w:t>
+      </w:r>
+    </w:p>
+    <w:p>
+      <w:pPr>
+        <w:spacing w:after="0"/>
+      </w:pPr>
+      <w:r>
+        <w:t xml:space="preserve">  "</w:t>
+      </w:r>
+      <w:proofErr w:type="spellStart"/>
+      <w:r>
+        <w:t>test</w:t>
+      </w:r>
+      <w:proofErr w:type="spellEnd"/>
+      <w:r>
+        <w:t>": "mocha ./</w:t>
+      </w:r>
+      <w:proofErr w:type="spellStart"/>
+      <w:r>
+        <w:t>test</w:t>
+      </w:r>
+      <w:proofErr w:type="spellEnd"/>
+      <w:r>
+        <w:t>/**/*.test.js --timeout=200000 --</w:t>
+      </w:r>
+      <w:proofErr w:type="spellStart"/>
+      <w:r>
+        <w:t>reporter</w:t>
+      </w:r>
+      <w:proofErr w:type="spellEnd"/>
+      <w:r>
+        <w:t xml:space="preserve"> </w:t>
+      </w:r>
+      <w:proofErr w:type="spellStart"/>
+      <w:r>
+        <w:t>mochawesome</w:t>
+      </w:r>
+      <w:proofErr w:type="spellEnd"/>
+      <w:r>
+        <w:t>"</w:t>
+      </w:r>
+    </w:p>
+    <w:p>
+      <w:pPr>
+        <w:spacing w:after="0"/>
+      </w:pPr>
+      <w:r>
+        <w:t>}</w:t>
+      </w:r>
+    </w:p>
+    <w:p>
+      <w:pPr>
+        <w:spacing w:after="0"/>
+      </w:pPr>
+      <w:r>
+        <w:t>A pasta de relatórios foi tratada como um artefato temporário e adicionada ao .</w:t>
+      </w:r>
+      <w:proofErr w:type="spellStart"/>
+      <w:r>
+        <w:t>gitignore</w:t>
+      </w:r>
+      <w:proofErr w:type="spellEnd"/>
+      <w:r>
+        <w:t>.</w:t>
+      </w:r>
+    </w:p>
+    <w:p>
+      <w:pPr>
+        <w:spacing w:after="0"/>
+      </w:pPr>
+      <w:r>
+        <w:t xml:space="preserve">Também foi criada a </w:t>
+      </w:r>
+      <w:proofErr w:type="spellStart"/>
+      <w:r>
+        <w:t>branch</w:t>
+      </w:r>
+      <w:proofErr w:type="spellEnd"/>
+      <w:r>
+        <w:t>:</w:t>
+      </w:r>
+    </w:p>
+    <w:p>
+      <w:pPr>
+        <w:spacing w:after="0"/>
+      </w:pPr>
+      <w:proofErr w:type="spellStart"/>
+      <w:r>
+        <w:t>relatorio</w:t>
+      </w:r>
+      <w:proofErr w:type="spellEnd"/>
+      <w:r>
+        <w:t>-</w:t>
+      </w:r>
+      <w:proofErr w:type="spellStart"/>
+      <w:r>
+        <w:t>execucao</w:t>
+      </w:r>
+      <w:proofErr w:type="spellEnd"/>
+      <w:r>
+        <w:t>-testes</w:t>
+      </w:r>
+    </w:p>
+    <w:p>
+      <w:pPr>
+        <w:spacing w:after="0"/>
+      </w:pPr>
+      <w:r>
+        <w:t xml:space="preserve">O fluxo de versionamento contemplou o envio das alterações ao GitHub e a integração com a </w:t>
+      </w:r>
+      <w:proofErr w:type="spellStart"/>
+      <w:r>
+        <w:t>branch</w:t>
+      </w:r>
+      <w:proofErr w:type="spellEnd"/>
+      <w:r>
+        <w:t xml:space="preserve"> principal.</w:t>
+      </w:r>
+    </w:p>
+    <w:p>
+      <w:pPr>
+        <w:spacing w:after="0"/>
+      </w:pPr>
+      <w:r>
         <w:lastRenderedPageBreak/>
-        <w:t>6.3 Script de teste de Login</w:t>
-      </w:r>
-    </w:p>
-    <w:p>
-      <w:r>
-        <w:t xml:space="preserve">Foi estruturado o primeiro script de teste para o </w:t>
-      </w:r>
-      <w:proofErr w:type="spellStart"/>
-      <w:r>
-        <w:t>endpoint</w:t>
-      </w:r>
-      <w:proofErr w:type="spellEnd"/>
-      <w:r>
-        <w:t xml:space="preserve"> de login da API, utilizando Mocha, </w:t>
+        <w:pict w14:anchorId="48F9945E">
+          <v:rect id="_x0000_i1035" style="width:0;height:1.5pt" o:hralign="center" o:hrstd="t" o:hr="t" fillcolor="#a0a0a0" stroked="f"/>
+        </w:pict>
+      </w:r>
+    </w:p>
+    <w:p>
+      <w:pPr>
+        <w:spacing w:after="0"/>
+        <w:rPr>
+          <w:b/>
+          <w:bCs/>
+        </w:rPr>
+      </w:pPr>
+      <w:r>
+        <w:rPr>
+          <w:b/>
+          <w:bCs/>
+        </w:rPr>
+        <w:t>8. SCRIPT DE TESTE PARA TRANSFERÊNCIAS</w:t>
+      </w:r>
+    </w:p>
+    <w:p>
+      <w:pPr>
+        <w:spacing w:after="0"/>
+      </w:pPr>
+      <w:r>
+        <w:t xml:space="preserve">Os testes automatizados de transferência foram organizados como parte da aplicação prática dos conceitos apresentados no módulo, considerando os </w:t>
+      </w:r>
+      <w:proofErr w:type="spellStart"/>
+      <w:r>
+        <w:t>endpoints</w:t>
+      </w:r>
+      <w:proofErr w:type="spellEnd"/>
+      <w:r>
+        <w:t xml:space="preserve"> e as regras de negócio analisadas durante o estudo.</w:t>
+      </w:r>
+    </w:p>
+    <w:p>
+      <w:pPr>
+        <w:spacing w:after="0"/>
+      </w:pPr>
+      <w:r>
+        <w:pict w14:anchorId="29BDAFB8">
+          <v:rect id="_x0000_i1039" style="width:0;height:1.5pt" o:hralign="center" o:bullet="t" o:hrstd="t" o:hr="t" fillcolor="#a0a0a0" stroked="f"/>
+        </w:pict>
+      </w:r>
+    </w:p>
+    <w:p>
+      <w:pPr>
+        <w:spacing w:after="0"/>
+        <w:rPr>
+          <w:b/>
+          <w:bCs/>
+          <w:sz w:val="28"/>
+          <w:szCs w:val="28"/>
+        </w:rPr>
+      </w:pPr>
+      <w:r>
+        <w:rPr>
+          <w:b/>
+          <w:bCs/>
+          <w:sz w:val="28"/>
+          <w:szCs w:val="28"/>
+        </w:rPr>
+        <w:t>REFATORAÇÃO PARA MANUTENÇÃO</w:t>
+      </w:r>
+    </w:p>
+    <w:p>
+      <w:pPr>
+        <w:spacing w:after="0"/>
+        <w:rPr>
+          <w:b/>
+          <w:bCs/>
+        </w:rPr>
+      </w:pPr>
+      <w:r>
+        <w:rPr>
+          <w:b/>
+          <w:bCs/>
+        </w:rPr>
+        <w:t xml:space="preserve">Variáveis de ambiente com </w:t>
+      </w:r>
+      <w:proofErr w:type="spellStart"/>
+      <w:r>
+        <w:rPr>
+          <w:b/>
+          <w:bCs/>
+        </w:rPr>
+        <w:t>dotenv</w:t>
+      </w:r>
+      <w:proofErr w:type="spellEnd"/>
+    </w:p>
+    <w:p>
+      <w:pPr>
+        <w:spacing w:after="0"/>
+        <w:rPr>
+          <w:b/>
+          <w:bCs/>
+        </w:rPr>
+      </w:pPr>
+    </w:p>
+    <w:p>
+      <w:pPr>
+        <w:spacing w:after="0"/>
+        <w:rPr>
+          <w:b/>
+          <w:bCs/>
+        </w:rPr>
+      </w:pPr>
+      <w:r>
+        <w:rPr>
+          <w:b/>
+          <w:bCs/>
+        </w:rPr>
+        <w:t xml:space="preserve">Documentação </w:t>
+      </w:r>
+      <w:proofErr w:type="spellStart"/>
+      <w:r>
+        <w:rPr>
+          <w:b/>
+          <w:bCs/>
+        </w:rPr>
+        <w:t>dotenv</w:t>
+      </w:r>
+      <w:proofErr w:type="spellEnd"/>
+      <w:r>
+        <w:rPr>
+          <w:b/>
+          <w:bCs/>
+        </w:rPr>
+        <w:t>:</w:t>
+      </w:r>
+      <w:r>
+        <w:t xml:space="preserve"> </w:t>
+      </w:r>
+      <w:r>
+        <w:t>https://www.npmjs.com/package/dotenv</w:t>
+      </w:r>
+    </w:p>
+    <w:p>
+      <w:pPr>
+        <w:spacing w:after="0"/>
+      </w:pPr>
+      <w:r>
+        <w:rPr>
+          <w:b/>
+          <w:bCs/>
+        </w:rPr>
+        <w:t xml:space="preserve">Instalação: </w:t>
+      </w:r>
+      <w:proofErr w:type="spellStart"/>
+      <w:r>
+        <w:t>npm</w:t>
+      </w:r>
+      <w:proofErr w:type="spellEnd"/>
+      <w:r>
+        <w:t xml:space="preserve"> </w:t>
+      </w:r>
+      <w:proofErr w:type="spellStart"/>
+      <w:r>
+        <w:t>install</w:t>
+      </w:r>
+      <w:proofErr w:type="spellEnd"/>
+      <w:r>
+        <w:t xml:space="preserve"> -D </w:t>
+      </w:r>
+      <w:proofErr w:type="spellStart"/>
+      <w:r>
+        <w:t>dotenv</w:t>
+      </w:r>
+      <w:proofErr w:type="spellEnd"/>
+    </w:p>
+    <w:p>
+      <w:pPr>
+        <w:spacing w:after="0"/>
+      </w:pPr>
+    </w:p>
+    <w:p>
+      <w:pPr>
+        <w:spacing w:after="0"/>
+      </w:pPr>
+      <w:r>
+        <w:t>• Criar arquivo .</w:t>
+      </w:r>
+      <w:proofErr w:type="spellStart"/>
+      <w:r>
+        <w:t>env</w:t>
+      </w:r>
+      <w:proofErr w:type="spellEnd"/>
+      <w:r>
+        <w:t xml:space="preserve"> na raiz com dados como BASE_URL.</w:t>
+      </w:r>
+    </w:p>
+    <w:p>
+      <w:pPr>
+        <w:spacing w:after="0"/>
+      </w:pPr>
+      <w:r>
+        <w:t xml:space="preserve">• Carregar as variáveis com </w:t>
+      </w:r>
+      <w:proofErr w:type="spellStart"/>
+      <w:r>
+        <w:t>import</w:t>
+      </w:r>
+      <w:proofErr w:type="spellEnd"/>
+      <w:r>
+        <w:t xml:space="preserve"> '</w:t>
+      </w:r>
+      <w:proofErr w:type="spellStart"/>
+      <w:r>
+        <w:t>dotenv</w:t>
+      </w:r>
+      <w:proofErr w:type="spellEnd"/>
+      <w:r>
+        <w:t>/</w:t>
+      </w:r>
+      <w:proofErr w:type="spellStart"/>
+      <w:r>
+        <w:t>config</w:t>
+      </w:r>
+      <w:proofErr w:type="spellEnd"/>
+      <w:r>
+        <w:t>'</w:t>
+      </w:r>
+      <w:r>
+        <w:t>.</w:t>
+      </w:r>
+    </w:p>
+    <w:p>
+      <w:pPr>
+        <w:spacing w:after="0"/>
+      </w:pPr>
+      <w:r>
+        <w:t xml:space="preserve">• Substituir URLs fixas por </w:t>
+      </w:r>
+      <w:proofErr w:type="spellStart"/>
+      <w:r>
+        <w:t>process.env.BASE_URL</w:t>
+      </w:r>
+      <w:proofErr w:type="spellEnd"/>
+      <w:r>
+        <w:t>, facilitando troca de ambientes.</w:t>
+      </w:r>
+    </w:p>
+    <w:p>
+      <w:pPr>
+        <w:spacing w:after="0"/>
+      </w:pPr>
+      <w:r>
+        <w:pict w14:anchorId="5ABC5FA5">
+          <v:rect id="_x0000_i1051" style="width:0;height:1.5pt" o:hralign="center" o:bullet="t" o:hrstd="t" o:hr="t" fillcolor="#a0a0a0" stroked="f"/>
+        </w:pict>
+      </w:r>
+    </w:p>
+    <w:p>
+      <w:pPr>
+        <w:spacing w:after="0"/>
+        <w:rPr>
+          <w:b/>
+          <w:bCs/>
+        </w:rPr>
+      </w:pPr>
+      <w:r>
+        <w:rPr>
+          <w:b/>
+          <w:bCs/>
+        </w:rPr>
+        <w:t xml:space="preserve">Melhorando Projeto de Testes Automatizados </w:t>
+      </w:r>
+      <w:proofErr w:type="spellStart"/>
+      <w:r>
+        <w:rPr>
+          <w:b/>
+          <w:bCs/>
+        </w:rPr>
+        <w:t>Helpers</w:t>
+      </w:r>
+      <w:proofErr w:type="spellEnd"/>
+    </w:p>
+    <w:p>
+      <w:pPr>
+        <w:spacing w:after="0"/>
+      </w:pPr>
+      <w:r>
+        <w:t>Funções de suporte aos testes</w:t>
+      </w:r>
+    </w:p>
+    <w:p>
+      <w:pPr>
+        <w:spacing w:after="0"/>
+      </w:pPr>
+    </w:p>
+    <w:p>
+      <w:pPr>
+        <w:spacing w:after="0"/>
+      </w:pPr>
+      <w:r>
+        <w:t xml:space="preserve">Criar a pasta </w:t>
+      </w:r>
+      <w:proofErr w:type="spellStart"/>
+      <w:r>
+        <w:t>helpers</w:t>
+      </w:r>
+      <w:proofErr w:type="spellEnd"/>
+    </w:p>
+    <w:p>
+      <w:pPr>
+        <w:pStyle w:val="PargrafodaLista"/>
+        <w:numPr>
+          <w:ilvl w:val="0"/>
+          <w:numId w:val="9"/>
+        </w:numPr>
+        <w:spacing w:after="0"/>
+      </w:pPr>
+      <w:r>
+        <w:t>Criar o arquivou autenticação.js</w:t>
+      </w:r>
+    </w:p>
+    <w:p>
+      <w:pPr>
+        <w:pStyle w:val="PargrafodaLista"/>
+        <w:numPr>
+          <w:ilvl w:val="0"/>
+          <w:numId w:val="9"/>
+        </w:numPr>
+        <w:spacing w:after="0"/>
+      </w:pPr>
+      <w:r>
+        <w:t xml:space="preserve">Criar uma função </w:t>
+      </w:r>
+      <w:r>
+        <w:t>anônima</w:t>
+      </w:r>
+      <w:r>
+        <w:t xml:space="preserve"> passando por parâmetro (usuário e senha)</w:t>
+      </w:r>
+    </w:p>
+    <w:p>
+      <w:pPr>
+        <w:pStyle w:val="PargrafodaLista"/>
+        <w:numPr>
+          <w:ilvl w:val="0"/>
+          <w:numId w:val="9"/>
+        </w:numPr>
+        <w:spacing w:after="0"/>
+      </w:pPr>
+      <w:r>
+        <w:t>Copiar a função de token da transferência e colar aqui, nos dados de usuário substituir pelos parâmetros.</w:t>
+      </w:r>
+    </w:p>
+    <w:p>
+      <w:pPr>
+        <w:pStyle w:val="PargrafodaLista"/>
+        <w:spacing w:after="0"/>
+      </w:pPr>
+    </w:p>
+    <w:p>
+      <w:pPr>
+        <w:spacing w:after="0"/>
+        <w:ind w:left="360"/>
+      </w:pPr>
+      <w:r>
+        <w:rPr>
+          <w:noProof/>
+        </w:rPr>
+        <w:drawing>
+          <wp:inline distT="0" distB="0" distL="0" distR="0" wp14:anchorId="56DB9A74" wp14:editId="6A6E7AB3">
+            <wp:extent cx="5152445" cy="3578499"/>
+            <wp:effectExtent l="0" t="0" r="0" b="3175"/>
+            <wp:docPr id="914104982" name="Imagem 1"/>
+            <wp:cNvGraphicFramePr>
+              <a:graphicFrameLocks xmlns:a="http://schemas.openxmlformats.org/drawingml/2006/main" noChangeAspect="1"/>
+            </wp:cNvGraphicFramePr>
+            <a:graphic xmlns:a="http://schemas.openxmlformats.org/drawingml/2006/main">
+              <a:graphicData uri="http://schemas.openxmlformats.org/drawingml/2006/picture">
+                <pic:pic xmlns:pic="http://schemas.openxmlformats.org/drawingml/2006/picture">
+                  <pic:nvPicPr>
+                    <pic:cNvPr id="914104982" name=""/>
+                    <pic:cNvPicPr/>
+                  </pic:nvPicPr>
+                  <pic:blipFill>
+                    <a:blip r:embed="rId11"/>
+                    <a:stretch>
+                      <a:fillRect/>
+                    </a:stretch>
+                  </pic:blipFill>
+                  <pic:spPr>
+                    <a:xfrm>
+                      <a:off x="0" y="0"/>
+                      <a:ext cx="5164192" cy="3586658"/>
+                    </a:xfrm>
+                    <a:prstGeom prst="rect">
+                      <a:avLst/>
+                    </a:prstGeom>
+                  </pic:spPr>
+                </pic:pic>
+              </a:graphicData>
+            </a:graphic>
+          </wp:inline>
+        </w:drawing>
+      </w:r>
+    </w:p>
+    <w:p>
+      <w:pPr>
+        <w:pStyle w:val="PargrafodaLista"/>
+        <w:spacing w:after="0"/>
+      </w:pPr>
+    </w:p>
+    <w:p>
+      <w:pPr>
+        <w:pStyle w:val="PargrafodaLista"/>
+        <w:numPr>
+          <w:ilvl w:val="0"/>
+          <w:numId w:val="9"/>
+        </w:numPr>
+        <w:spacing w:after="0"/>
+      </w:pPr>
+      <w:r>
+        <w:t xml:space="preserve">No teste de transferência importe o </w:t>
+      </w:r>
+      <w:proofErr w:type="spellStart"/>
+      <w:r>
+        <w:t>helper</w:t>
+      </w:r>
+      <w:proofErr w:type="spellEnd"/>
+      <w:r>
+        <w:t xml:space="preserve"> e autenticação</w:t>
+      </w:r>
+    </w:p>
+    <w:p>
+      <w:pPr>
+        <w:pStyle w:val="PargrafodaLista"/>
+        <w:numPr>
+          <w:ilvl w:val="0"/>
+          <w:numId w:val="9"/>
+        </w:numPr>
+        <w:shd w:val="clear" w:color="auto" w:fill="282C34"/>
+        <w:spacing w:after="0" w:line="330" w:lineRule="atLeast"/>
+        <w:rPr>
+          <w:rFonts w:ascii="Consolas" w:eastAsia="Times New Roman" w:hAnsi="Consolas" w:cs="Times New Roman"/>
+          <w:color w:val="ABB2BF"/>
+          <w:kern w:val="0"/>
+          <w:lang w:eastAsia="pt-BR"/>
+          <w14:ligatures w14:val="none"/>
+        </w:rPr>
+      </w:pPr>
+      <w:proofErr w:type="spellStart"/>
+      <w:r>
+        <w:rPr>
+          <w:rFonts w:ascii="Consolas" w:eastAsia="Times New Roman" w:hAnsi="Consolas" w:cs="Times New Roman"/>
+          <w:color w:val="C678DD"/>
+          <w:kern w:val="0"/>
+          <w:lang w:eastAsia="pt-BR"/>
+          <w14:ligatures w14:val="none"/>
+        </w:rPr>
+        <w:t>import</w:t>
+      </w:r>
+      <w:proofErr w:type="spellEnd"/>
+      <w:r>
+        <w:rPr>
+          <w:rFonts w:ascii="Consolas" w:eastAsia="Times New Roman" w:hAnsi="Consolas" w:cs="Times New Roman"/>
+          <w:color w:val="ABB2BF"/>
+          <w:kern w:val="0"/>
+          <w:lang w:eastAsia="pt-BR"/>
+          <w14:ligatures w14:val="none"/>
+        </w:rPr>
+        <w:t xml:space="preserve"> { </w:t>
+      </w:r>
+      <w:proofErr w:type="spellStart"/>
+      <w:r>
+        <w:rPr>
+          <w:rFonts w:ascii="Consolas" w:eastAsia="Times New Roman" w:hAnsi="Consolas" w:cs="Times New Roman"/>
+          <w:color w:val="E06C75"/>
+          <w:kern w:val="0"/>
+          <w:lang w:eastAsia="pt-BR"/>
+          <w14:ligatures w14:val="none"/>
+        </w:rPr>
+        <w:t>obterToken</w:t>
+      </w:r>
+      <w:proofErr w:type="spellEnd"/>
+      <w:r>
+        <w:rPr>
+          <w:rFonts w:ascii="Consolas" w:eastAsia="Times New Roman" w:hAnsi="Consolas" w:cs="Times New Roman"/>
+          <w:color w:val="ABB2BF"/>
+          <w:kern w:val="0"/>
+          <w:lang w:eastAsia="pt-BR"/>
+          <w14:ligatures w14:val="none"/>
+        </w:rPr>
+        <w:t xml:space="preserve"> } </w:t>
+      </w:r>
+      <w:proofErr w:type="spellStart"/>
+      <w:r>
+        <w:rPr>
+          <w:rFonts w:ascii="Consolas" w:eastAsia="Times New Roman" w:hAnsi="Consolas" w:cs="Times New Roman"/>
+          <w:color w:val="C678DD"/>
+          <w:kern w:val="0"/>
+          <w:lang w:eastAsia="pt-BR"/>
+          <w14:ligatures w14:val="none"/>
+        </w:rPr>
+        <w:t>from</w:t>
+      </w:r>
+      <w:proofErr w:type="spellEnd"/>
+      <w:r>
+        <w:rPr>
+          <w:rFonts w:ascii="Consolas" w:eastAsia="Times New Roman" w:hAnsi="Consolas" w:cs="Times New Roman"/>
+          <w:color w:val="ABB2BF"/>
+          <w:kern w:val="0"/>
+          <w:lang w:eastAsia="pt-BR"/>
+          <w14:ligatures w14:val="none"/>
+        </w:rPr>
+        <w:t xml:space="preserve"> </w:t>
+      </w:r>
+      <w:r>
+        <w:rPr>
+          <w:rFonts w:ascii="Consolas" w:eastAsia="Times New Roman" w:hAnsi="Consolas" w:cs="Times New Roman"/>
+          <w:color w:val="98C379"/>
+          <w:kern w:val="0"/>
+          <w:lang w:eastAsia="pt-BR"/>
+          <w14:ligatures w14:val="none"/>
+        </w:rPr>
+        <w:t>'../</w:t>
+      </w:r>
+      <w:proofErr w:type="spellStart"/>
+      <w:r>
+        <w:rPr>
+          <w:rFonts w:ascii="Consolas" w:eastAsia="Times New Roman" w:hAnsi="Consolas" w:cs="Times New Roman"/>
+          <w:color w:val="98C379"/>
+          <w:kern w:val="0"/>
+          <w:lang w:eastAsia="pt-BR"/>
+          <w14:ligatures w14:val="none"/>
+        </w:rPr>
+        <w:t>helpers</w:t>
+      </w:r>
+      <w:proofErr w:type="spellEnd"/>
+      <w:r>
+        <w:rPr>
+          <w:rFonts w:ascii="Consolas" w:eastAsia="Times New Roman" w:hAnsi="Consolas" w:cs="Times New Roman"/>
+          <w:color w:val="98C379"/>
+          <w:kern w:val="0"/>
+          <w:lang w:eastAsia="pt-BR"/>
+          <w14:ligatures w14:val="none"/>
+        </w:rPr>
+        <w:t>/autenticacao.js'</w:t>
+      </w:r>
+    </w:p>
+    <w:p>
+      <w:pPr>
+        <w:pStyle w:val="PargrafodaLista"/>
+        <w:spacing w:after="0"/>
+      </w:pPr>
+    </w:p>
+    <w:p>
+      <w:pPr>
+        <w:pStyle w:val="PargrafodaLista"/>
+        <w:numPr>
+          <w:ilvl w:val="0"/>
+          <w:numId w:val="9"/>
+        </w:numPr>
+        <w:spacing w:after="0"/>
+      </w:pPr>
+      <w:r>
+        <w:lastRenderedPageBreak/>
+        <w:t>Substitua a o trecho de obter token pela chamada da função passando os dados de login do usuário</w:t>
+      </w:r>
+    </w:p>
+    <w:p>
+      <w:pPr>
+        <w:pStyle w:val="PargrafodaLista"/>
+        <w:numPr>
+          <w:ilvl w:val="0"/>
+          <w:numId w:val="9"/>
+        </w:numPr>
+        <w:shd w:val="clear" w:color="auto" w:fill="282C34"/>
+        <w:spacing w:after="0" w:line="330" w:lineRule="atLeast"/>
+        <w:rPr>
+          <w:rFonts w:ascii="Consolas" w:eastAsia="Times New Roman" w:hAnsi="Consolas" w:cs="Times New Roman"/>
+          <w:color w:val="ABB2BF"/>
+          <w:kern w:val="0"/>
+          <w:lang w:eastAsia="pt-BR"/>
+          <w14:ligatures w14:val="none"/>
+        </w:rPr>
+      </w:pPr>
+      <w:proofErr w:type="spellStart"/>
+      <w:r>
+        <w:rPr>
+          <w:rFonts w:ascii="Consolas" w:eastAsia="Times New Roman" w:hAnsi="Consolas" w:cs="Times New Roman"/>
+          <w:color w:val="C678DD"/>
+          <w:kern w:val="0"/>
+          <w:lang w:eastAsia="pt-BR"/>
+          <w14:ligatures w14:val="none"/>
+        </w:rPr>
+        <w:t>const</w:t>
+      </w:r>
+      <w:proofErr w:type="spellEnd"/>
+      <w:r>
+        <w:rPr>
+          <w:rFonts w:ascii="Consolas" w:eastAsia="Times New Roman" w:hAnsi="Consolas" w:cs="Times New Roman"/>
+          <w:color w:val="ABB2BF"/>
+          <w:kern w:val="0"/>
+          <w:lang w:eastAsia="pt-BR"/>
+          <w14:ligatures w14:val="none"/>
+        </w:rPr>
+        <w:t xml:space="preserve"> </w:t>
+      </w:r>
+      <w:r>
+        <w:rPr>
+          <w:rFonts w:ascii="Consolas" w:eastAsia="Times New Roman" w:hAnsi="Consolas" w:cs="Times New Roman"/>
+          <w:color w:val="E5C07B"/>
+          <w:kern w:val="0"/>
+          <w:lang w:eastAsia="pt-BR"/>
+          <w14:ligatures w14:val="none"/>
+        </w:rPr>
+        <w:t>token</w:t>
+      </w:r>
+      <w:r>
+        <w:rPr>
+          <w:rFonts w:ascii="Consolas" w:eastAsia="Times New Roman" w:hAnsi="Consolas" w:cs="Times New Roman"/>
+          <w:color w:val="ABB2BF"/>
+          <w:kern w:val="0"/>
+          <w:lang w:eastAsia="pt-BR"/>
+          <w14:ligatures w14:val="none"/>
+        </w:rPr>
+        <w:t xml:space="preserve"> </w:t>
+      </w:r>
+      <w:r>
+        <w:rPr>
+          <w:rFonts w:ascii="Consolas" w:eastAsia="Times New Roman" w:hAnsi="Consolas" w:cs="Times New Roman"/>
+          <w:color w:val="56B6C2"/>
+          <w:kern w:val="0"/>
+          <w:lang w:eastAsia="pt-BR"/>
+          <w14:ligatures w14:val="none"/>
+        </w:rPr>
+        <w:t>=</w:t>
+      </w:r>
+      <w:r>
+        <w:rPr>
+          <w:rFonts w:ascii="Consolas" w:eastAsia="Times New Roman" w:hAnsi="Consolas" w:cs="Times New Roman"/>
+          <w:color w:val="ABB2BF"/>
+          <w:kern w:val="0"/>
+          <w:lang w:eastAsia="pt-BR"/>
+          <w14:ligatures w14:val="none"/>
+        </w:rPr>
+        <w:t xml:space="preserve"> </w:t>
+      </w:r>
+      <w:proofErr w:type="spellStart"/>
+      <w:r>
+        <w:rPr>
+          <w:rFonts w:ascii="Consolas" w:eastAsia="Times New Roman" w:hAnsi="Consolas" w:cs="Times New Roman"/>
+          <w:color w:val="C678DD"/>
+          <w:kern w:val="0"/>
+          <w:lang w:eastAsia="pt-BR"/>
+          <w14:ligatures w14:val="none"/>
+        </w:rPr>
+        <w:t>await</w:t>
+      </w:r>
+      <w:proofErr w:type="spellEnd"/>
+      <w:r>
+        <w:rPr>
+          <w:rFonts w:ascii="Consolas" w:eastAsia="Times New Roman" w:hAnsi="Consolas" w:cs="Times New Roman"/>
+          <w:color w:val="ABB2BF"/>
+          <w:kern w:val="0"/>
+          <w:lang w:eastAsia="pt-BR"/>
+          <w14:ligatures w14:val="none"/>
+        </w:rPr>
+        <w:t xml:space="preserve"> </w:t>
+      </w:r>
+      <w:proofErr w:type="spellStart"/>
+      <w:r>
+        <w:rPr>
+          <w:rFonts w:ascii="Consolas" w:eastAsia="Times New Roman" w:hAnsi="Consolas" w:cs="Times New Roman"/>
+          <w:color w:val="61AFEF"/>
+          <w:kern w:val="0"/>
+          <w:lang w:eastAsia="pt-BR"/>
+          <w14:ligatures w14:val="none"/>
+        </w:rPr>
+        <w:t>obterToken</w:t>
+      </w:r>
+      <w:proofErr w:type="spellEnd"/>
+      <w:r>
+        <w:rPr>
+          <w:rFonts w:ascii="Consolas" w:eastAsia="Times New Roman" w:hAnsi="Consolas" w:cs="Times New Roman"/>
+          <w:color w:val="ABB2BF"/>
+          <w:kern w:val="0"/>
+          <w:lang w:eastAsia="pt-BR"/>
+          <w14:ligatures w14:val="none"/>
+        </w:rPr>
+        <w:t>(</w:t>
+      </w:r>
+      <w:r>
+        <w:rPr>
+          <w:rFonts w:ascii="Consolas" w:eastAsia="Times New Roman" w:hAnsi="Consolas" w:cs="Times New Roman"/>
+          <w:color w:val="98C379"/>
+          <w:kern w:val="0"/>
+          <w:lang w:eastAsia="pt-BR"/>
+          <w14:ligatures w14:val="none"/>
+        </w:rPr>
+        <w:t>'</w:t>
+      </w:r>
+      <w:proofErr w:type="spellStart"/>
+      <w:r>
+        <w:rPr>
+          <w:rFonts w:ascii="Consolas" w:eastAsia="Times New Roman" w:hAnsi="Consolas" w:cs="Times New Roman"/>
+          <w:color w:val="98C379"/>
+          <w:kern w:val="0"/>
+          <w:lang w:eastAsia="pt-BR"/>
+          <w14:ligatures w14:val="none"/>
+        </w:rPr>
+        <w:t>julio.lima</w:t>
+      </w:r>
+      <w:proofErr w:type="spellEnd"/>
+      <w:r>
+        <w:rPr>
+          <w:rFonts w:ascii="Consolas" w:eastAsia="Times New Roman" w:hAnsi="Consolas" w:cs="Times New Roman"/>
+          <w:color w:val="98C379"/>
+          <w:kern w:val="0"/>
+          <w:lang w:eastAsia="pt-BR"/>
+          <w14:ligatures w14:val="none"/>
+        </w:rPr>
+        <w:t>'</w:t>
+      </w:r>
+      <w:r>
+        <w:rPr>
+          <w:rFonts w:ascii="Consolas" w:eastAsia="Times New Roman" w:hAnsi="Consolas" w:cs="Times New Roman"/>
+          <w:color w:val="ABB2BF"/>
+          <w:kern w:val="0"/>
+          <w:lang w:eastAsia="pt-BR"/>
+          <w14:ligatures w14:val="none"/>
+        </w:rPr>
+        <w:t xml:space="preserve">, </w:t>
+      </w:r>
+      <w:r>
+        <w:rPr>
+          <w:rFonts w:ascii="Consolas" w:eastAsia="Times New Roman" w:hAnsi="Consolas" w:cs="Times New Roman"/>
+          <w:color w:val="98C379"/>
+          <w:kern w:val="0"/>
+          <w:lang w:eastAsia="pt-BR"/>
+          <w14:ligatures w14:val="none"/>
+        </w:rPr>
+        <w:t>'123456'</w:t>
+      </w:r>
+      <w:r>
+        <w:rPr>
+          <w:rFonts w:ascii="Consolas" w:eastAsia="Times New Roman" w:hAnsi="Consolas" w:cs="Times New Roman"/>
+          <w:color w:val="ABB2BF"/>
+          <w:kern w:val="0"/>
+          <w:lang w:eastAsia="pt-BR"/>
+          <w14:ligatures w14:val="none"/>
+        </w:rPr>
+        <w:t>)</w:t>
+      </w:r>
+    </w:p>
+    <w:p>
+      <w:pPr>
+        <w:pStyle w:val="PargrafodaLista"/>
+        <w:spacing w:after="0"/>
+      </w:pPr>
+    </w:p>
+    <w:p>
+      <w:pPr>
+        <w:spacing w:after="0"/>
+      </w:pPr>
+      <w:r>
+        <w:tab/>
+      </w:r>
+    </w:p>
+    <w:p>
+      <w:pPr>
+        <w:spacing w:after="0"/>
+      </w:pPr>
+      <w:r>
+        <w:pict w14:anchorId="09B93132">
+          <v:rect id="_x0000_i1052" style="width:0;height:1.5pt" o:hralign="center" o:hrstd="t" o:hr="t" fillcolor="#a0a0a0" stroked="f"/>
+        </w:pict>
+      </w:r>
+    </w:p>
+    <w:p>
+      <w:pPr>
+        <w:spacing w:after="0"/>
+        <w:rPr>
+          <w:b/>
+          <w:bCs/>
+        </w:rPr>
+      </w:pPr>
+      <w:r>
+        <w:rPr>
+          <w:b/>
+          <w:bCs/>
+        </w:rPr>
+        <w:t xml:space="preserve">Melhorando Projeto de Testes Automatizados </w:t>
+      </w:r>
+      <w:proofErr w:type="spellStart"/>
+      <w:r>
+        <w:rPr>
+          <w:b/>
+          <w:bCs/>
+        </w:rPr>
+        <w:t>hook</w:t>
+      </w:r>
+      <w:proofErr w:type="spellEnd"/>
+      <w:r>
+        <w:rPr>
+          <w:b/>
+          <w:bCs/>
+        </w:rPr>
+        <w:t xml:space="preserve"> </w:t>
+      </w:r>
+      <w:proofErr w:type="spellStart"/>
+      <w:r>
+        <w:rPr>
+          <w:b/>
+          <w:bCs/>
+        </w:rPr>
+        <w:t>before</w:t>
+      </w:r>
+      <w:proofErr w:type="spellEnd"/>
+      <w:r>
+        <w:rPr>
+          <w:b/>
+          <w:bCs/>
+        </w:rPr>
+        <w:t xml:space="preserve"> </w:t>
+      </w:r>
+      <w:proofErr w:type="spellStart"/>
+      <w:r>
+        <w:rPr>
+          <w:b/>
+          <w:bCs/>
+        </w:rPr>
+        <w:t>each</w:t>
+      </w:r>
+      <w:proofErr w:type="spellEnd"/>
+    </w:p>
+    <w:p>
+      <w:pPr>
+        <w:spacing w:after="0"/>
+        <w:rPr>
+          <w:b/>
+          <w:bCs/>
+        </w:rPr>
+      </w:pPr>
+    </w:p>
+    <w:tbl>
+      <w:tblPr>
+        <w:tblStyle w:val="Tabelacomgrade"/>
+        <w:tblW w:w="0" w:type="auto"/>
+        <w:tblLook w:val="04A0" w:firstRow="1" w:lastRow="0" w:firstColumn="1" w:lastColumn="0" w:noHBand="0" w:noVBand="1"/>
+      </w:tblPr>
+      <w:tblGrid>
+        <w:gridCol w:w="3485"/>
+        <w:gridCol w:w="3485"/>
+        <w:gridCol w:w="3486"/>
+      </w:tblGrid>
+      <w:tr>
+        <w:tc>
+          <w:tcPr>
+            <w:tcW w:w="3485" w:type="dxa"/>
+          </w:tcPr>
+          <w:p>
+            <w:pPr>
+              <w:tabs>
+                <w:tab w:val="center" w:pos="1634"/>
+              </w:tabs>
+              <w:rPr>
+                <w:b/>
+                <w:bCs/>
+              </w:rPr>
+            </w:pPr>
+            <w:r>
+              <w:rPr>
+                <w:b/>
+                <w:bCs/>
+              </w:rPr>
+              <w:t>Hook</w:t>
+            </w:r>
+          </w:p>
+        </w:tc>
+        <w:tc>
+          <w:tcPr>
+            <w:tcW w:w="3485" w:type="dxa"/>
+          </w:tcPr>
+          <w:p>
+            <w:pPr>
+              <w:rPr>
+                <w:b/>
+                <w:bCs/>
+              </w:rPr>
+            </w:pPr>
+            <w:r>
+              <w:rPr>
+                <w:b/>
+                <w:bCs/>
+              </w:rPr>
+              <w:t>Momento</w:t>
+            </w:r>
+          </w:p>
+        </w:tc>
+        <w:tc>
+          <w:tcPr>
+            <w:tcW w:w="3486" w:type="dxa"/>
+          </w:tcPr>
+          <w:p>
+            <w:pPr>
+              <w:rPr>
+                <w:b/>
+                <w:bCs/>
+              </w:rPr>
+            </w:pPr>
+            <w:r>
+              <w:rPr>
+                <w:b/>
+                <w:bCs/>
+              </w:rPr>
+              <w:t>Uso típico</w:t>
+            </w:r>
+          </w:p>
+        </w:tc>
+      </w:tr>
+      <w:tr>
+        <w:tc>
+          <w:tcPr>
+            <w:tcW w:w="3485" w:type="dxa"/>
+          </w:tcPr>
+          <w:p>
+            <w:proofErr w:type="spellStart"/>
+            <w:r>
+              <w:t>before</w:t>
+            </w:r>
+            <w:proofErr w:type="spellEnd"/>
+          </w:p>
+        </w:tc>
+        <w:tc>
+          <w:tcPr>
+            <w:tcW w:w="3485" w:type="dxa"/>
+          </w:tcPr>
+          <w:p>
+            <w:r>
+              <w:t>Uma vez antes da suíte</w:t>
+            </w:r>
+          </w:p>
+        </w:tc>
+        <w:tc>
+          <w:tcPr>
+            <w:tcW w:w="3486" w:type="dxa"/>
+          </w:tcPr>
+          <w:p>
+            <w:r>
+              <w:t>Preparar ambiente</w:t>
+            </w:r>
+          </w:p>
+        </w:tc>
+      </w:tr>
+      <w:tr>
+        <w:tc>
+          <w:tcPr>
+            <w:tcW w:w="3485" w:type="dxa"/>
+          </w:tcPr>
+          <w:p>
+            <w:proofErr w:type="spellStart"/>
+            <w:r>
+              <w:t>beforeEach</w:t>
+            </w:r>
+            <w:proofErr w:type="spellEnd"/>
+          </w:p>
+        </w:tc>
+        <w:tc>
+          <w:tcPr>
+            <w:tcW w:w="3485" w:type="dxa"/>
+          </w:tcPr>
+          <w:p>
+            <w:r>
+              <w:t>Antes de cada teste</w:t>
+            </w:r>
+          </w:p>
+        </w:tc>
+        <w:tc>
+          <w:tcPr>
+            <w:tcW w:w="3486" w:type="dxa"/>
+          </w:tcPr>
+          <w:p>
+            <w:r>
+              <w:t>Gerar token/massa</w:t>
+            </w:r>
+          </w:p>
+        </w:tc>
+      </w:tr>
+      <w:tr>
+        <w:tc>
+          <w:tcPr>
+            <w:tcW w:w="3485" w:type="dxa"/>
+          </w:tcPr>
+          <w:p>
+            <w:proofErr w:type="spellStart"/>
+            <w:r>
+              <w:t>afterEach</w:t>
+            </w:r>
+            <w:proofErr w:type="spellEnd"/>
+          </w:p>
+        </w:tc>
+        <w:tc>
+          <w:tcPr>
+            <w:tcW w:w="3485" w:type="dxa"/>
+          </w:tcPr>
+          <w:p>
+            <w:r>
+              <w:t>Após cada teste</w:t>
+            </w:r>
+          </w:p>
+        </w:tc>
+        <w:tc>
+          <w:tcPr>
+            <w:tcW w:w="3486" w:type="dxa"/>
+          </w:tcPr>
+          <w:p>
+            <w:r>
+              <w:t>Limpar dados</w:t>
+            </w:r>
+          </w:p>
+        </w:tc>
+      </w:tr>
+      <w:tr>
+        <w:tc>
+          <w:tcPr>
+            <w:tcW w:w="3485" w:type="dxa"/>
+          </w:tcPr>
+          <w:p>
+            <w:proofErr w:type="spellStart"/>
+            <w:r>
+              <w:t>after</w:t>
+            </w:r>
+            <w:proofErr w:type="spellEnd"/>
+          </w:p>
+        </w:tc>
+        <w:tc>
+          <w:tcPr>
+            <w:tcW w:w="3485" w:type="dxa"/>
+          </w:tcPr>
+          <w:p>
+            <w:r>
+              <w:t>Uma vez ao final</w:t>
+            </w:r>
+          </w:p>
+        </w:tc>
+        <w:tc>
+          <w:tcPr>
+            <w:tcW w:w="3486" w:type="dxa"/>
+          </w:tcPr>
+          <w:p>
+            <w:r>
+              <w:t>Encerrar recurso</w:t>
+            </w:r>
+          </w:p>
+        </w:tc>
+      </w:tr>
+    </w:tbl>
+    <w:p>
+      <w:pPr>
+        <w:spacing w:after="0"/>
+      </w:pPr>
+    </w:p>
+    <w:p>
+      <w:pPr>
+        <w:spacing w:after="0"/>
+      </w:pPr>
+      <w:r>
+        <w:rPr>
+          <w:noProof/>
+        </w:rPr>
+        <w:drawing>
+          <wp:inline distT="0" distB="0" distL="0" distR="0" wp14:anchorId="79ADA55F" wp14:editId="15AE1A76">
+            <wp:extent cx="6543675" cy="2152650"/>
+            <wp:effectExtent l="0" t="0" r="9525" b="0"/>
+            <wp:docPr id="193564132" name="Imagem 1"/>
+            <wp:cNvGraphicFramePr>
+              <a:graphicFrameLocks xmlns:a="http://schemas.openxmlformats.org/drawingml/2006/main" noChangeAspect="1"/>
+            </wp:cNvGraphicFramePr>
+            <a:graphic xmlns:a="http://schemas.openxmlformats.org/drawingml/2006/main">
+              <a:graphicData uri="http://schemas.openxmlformats.org/drawingml/2006/picture">
+                <pic:pic xmlns:pic="http://schemas.openxmlformats.org/drawingml/2006/picture">
+                  <pic:nvPicPr>
+                    <pic:cNvPr id="193564132" name=""/>
+                    <pic:cNvPicPr/>
+                  </pic:nvPicPr>
+                  <pic:blipFill>
+                    <a:blip r:embed="rId12"/>
+                    <a:stretch>
+                      <a:fillRect/>
+                    </a:stretch>
+                  </pic:blipFill>
+                  <pic:spPr>
+                    <a:xfrm>
+                      <a:off x="0" y="0"/>
+                      <a:ext cx="6543675" cy="2152650"/>
+                    </a:xfrm>
+                    <a:prstGeom prst="rect">
+                      <a:avLst/>
+                    </a:prstGeom>
+                  </pic:spPr>
+                </pic:pic>
+              </a:graphicData>
+            </a:graphic>
+          </wp:inline>
+        </w:drawing>
+      </w:r>
+    </w:p>
+    <w:p>
+      <w:pPr>
+        <w:spacing w:after="0"/>
+      </w:pPr>
+      <w:r>
+        <w:pict w14:anchorId="574CE202">
+          <v:rect id="_x0000_i1055" style="width:0;height:1.5pt" o:hralign="center" o:bullet="t" o:hrstd="t" o:hr="t" fillcolor="#a0a0a0" stroked="f"/>
+        </w:pict>
+      </w:r>
+    </w:p>
+    <w:p>
+      <w:pPr>
+        <w:spacing w:after="0"/>
+        <w:rPr>
+          <w:b/>
+          <w:bCs/>
+        </w:rPr>
+      </w:pPr>
+      <w:r>
+        <w:rPr>
+          <w:b/>
+          <w:bCs/>
+        </w:rPr>
+        <w:t xml:space="preserve">Melhorando Projeto de Testes Automatizados </w:t>
+      </w:r>
+      <w:proofErr w:type="spellStart"/>
+      <w:r>
+        <w:rPr>
+          <w:b/>
+          <w:bCs/>
+        </w:rPr>
+        <w:t>Fixtures</w:t>
+      </w:r>
+      <w:proofErr w:type="spellEnd"/>
+      <w:r>
+        <w:rPr>
+          <w:b/>
+          <w:bCs/>
+        </w:rPr>
+        <w:t xml:space="preserve"> e massa de dados</w:t>
+      </w:r>
+    </w:p>
+    <w:p>
+      <w:pPr>
+        <w:spacing w:after="0"/>
+      </w:pPr>
+      <w:r>
+        <w:t>Pasta com arquivos que ajuda na execução dos testes</w:t>
+      </w:r>
+    </w:p>
+    <w:p>
+      <w:pPr>
+        <w:spacing w:after="0"/>
+      </w:pPr>
+    </w:p>
+    <w:p>
+      <w:pPr>
+        <w:spacing w:after="0"/>
+      </w:pPr>
+      <w:r>
+        <w:t xml:space="preserve">• </w:t>
+      </w:r>
+      <w:proofErr w:type="spellStart"/>
+      <w:r>
+        <w:t>Fixtures</w:t>
+      </w:r>
+      <w:proofErr w:type="spellEnd"/>
+      <w:r>
+        <w:t xml:space="preserve"> são arquivos estáticos, normalmente JSON, usados para centralizar massas de teste.</w:t>
+      </w:r>
+    </w:p>
+    <w:p>
+      <w:pPr>
+        <w:spacing w:after="0"/>
+      </w:pPr>
+      <w:r>
+        <w:t>• Para alterar somente um campo sem modificar o objeto original, pode-se usar cópia rasa com spread: {</w:t>
+      </w:r>
+    </w:p>
+    <w:p>
+      <w:pPr>
+        <w:spacing w:after="0"/>
+      </w:pPr>
+      <w:r>
+        <w:t>...objeto }.</w:t>
+      </w:r>
+    </w:p>
+    <w:p>
+      <w:pPr>
+        <w:spacing w:after="0"/>
+      </w:pPr>
+      <w:r>
+        <w:t xml:space="preserve">• Em objetos aninhados, uma cópia profunda como </w:t>
+      </w:r>
+      <w:proofErr w:type="spellStart"/>
+      <w:r>
+        <w:t>structuredClone</w:t>
+      </w:r>
+      <w:proofErr w:type="spellEnd"/>
+      <w:r>
+        <w:t>(objeto) evita compartilhamento de</w:t>
+      </w:r>
+    </w:p>
+    <w:p>
+      <w:pPr>
+        <w:spacing w:after="0"/>
+      </w:pPr>
+      <w:r>
+        <w:t>referências internas.</w:t>
+      </w:r>
+    </w:p>
+    <w:p>
+      <w:pPr>
+        <w:spacing w:after="0"/>
+      </w:pPr>
+      <w:r>
+        <w:pict w14:anchorId="056A3627">
+          <v:rect id="_x0000_i1116" style="width:0;height:1.5pt" o:hralign="center" o:bullet="t" o:hrstd="t" o:hr="t" fillcolor="#a0a0a0" stroked="f"/>
+        </w:pict>
+      </w:r>
+    </w:p>
+    <w:p>
+      <w:pPr>
+        <w:spacing w:after="0"/>
+      </w:pPr>
+    </w:p>
+    <w:p>
+      <w:pPr>
+        <w:spacing w:after="0"/>
+      </w:pPr>
+      <w:r>
+        <w:pict w14:anchorId="2C3BC3BF">
+          <v:rect id="_x0000_i1118" style="width:0;height:1.5pt" o:hralign="center" o:bullet="t" o:hrstd="t" o:hr="t" fillcolor="#a0a0a0" stroked="f"/>
+        </w:pict>
+      </w:r>
+    </w:p>
+    <w:p>
+      <w:pPr>
+        <w:spacing w:after="0"/>
+      </w:pPr>
+    </w:p>
+    <w:p>
+      <w:pPr>
+        <w:spacing w:after="0"/>
+      </w:pPr>
+    </w:p>
+    <w:p>
+      <w:pPr>
+        <w:spacing w:after="0"/>
+        <w:rPr>
+          <w:b/>
+          <w:bCs/>
+        </w:rPr>
+      </w:pPr>
+      <w:r>
+        <w:rPr>
+          <w:b/>
+          <w:bCs/>
+        </w:rPr>
+        <w:t>. SÍNTESE DO APRENDIZADO</w:t>
+      </w:r>
+    </w:p>
+    <w:p>
+      <w:pPr>
+        <w:spacing w:after="0"/>
+      </w:pPr>
+      <w:r>
+        <w:t xml:space="preserve">O módulo consolidou os principais conceitos relacionados aos testes de APIs REST, desde a análise dos </w:t>
+      </w:r>
+      <w:proofErr w:type="spellStart"/>
+      <w:r>
+        <w:t>endpoints</w:t>
+      </w:r>
+      <w:proofErr w:type="spellEnd"/>
+      <w:r>
+        <w:t xml:space="preserve"> e das regras de negócio até a identificação de cenários por meio da heurística VADER.</w:t>
+      </w:r>
+    </w:p>
+    <w:p>
+      <w:pPr>
+        <w:spacing w:after="0"/>
+      </w:pPr>
+      <w:r>
+        <w:t>Também foram estudados e aplicados conceitos de autenticação, autorização, métodos HTTP, validação de dados, códigos de erro, responsividade e análise de possíveis falhas na API.</w:t>
+      </w:r>
+    </w:p>
+    <w:p>
+      <w:pPr>
+        <w:spacing w:after="0"/>
+      </w:pPr>
+      <w:r>
+        <w:t xml:space="preserve">Na etapa de automação, foram utilizados Mocha, </w:t>
       </w:r>
       <w:proofErr w:type="spellStart"/>
       <w:r>
@@ -6677,375 +8811,31 @@
       </w:r>
       <w:proofErr w:type="spellEnd"/>
       <w:r>
-        <w:t xml:space="preserve"> e Chai.</w:t>
-      </w:r>
-    </w:p>
-    <w:p>
-      <w:pPr>
-        <w:rPr>
-          <w:b/>
-          <w:bCs/>
-        </w:rPr>
-      </w:pPr>
-      <w:r>
-        <w:rPr>
-          <w:b/>
-          <w:bCs/>
-        </w:rPr>
-        <w:t>6.4 Execução dos testes</w:t>
-      </w:r>
-    </w:p>
-    <w:p>
-      <w:r>
-        <w:t xml:space="preserve">O Mocha foi configurado no </w:t>
-      </w:r>
-      <w:proofErr w:type="spellStart"/>
-      <w:r>
-        <w:t>package.json</w:t>
-      </w:r>
-      <w:proofErr w:type="spellEnd"/>
-      <w:r>
-        <w:t xml:space="preserve"> para localizar os arquivos de teste:</w:t>
-      </w:r>
-    </w:p>
-    <w:p>
-      <w:r>
-        <w:t>"scripts": {</w:t>
-      </w:r>
-    </w:p>
-    <w:p>
-      <w:r>
-        <w:t xml:space="preserve">  "</w:t>
-      </w:r>
-      <w:proofErr w:type="spellStart"/>
-      <w:r>
-        <w:t>test</w:t>
-      </w:r>
-      <w:proofErr w:type="spellEnd"/>
-      <w:r>
-        <w:t>": "mocha ./</w:t>
-      </w:r>
-      <w:proofErr w:type="spellStart"/>
-      <w:r>
-        <w:t>test</w:t>
-      </w:r>
-      <w:proofErr w:type="spellEnd"/>
-      <w:r>
-        <w:t>/**/*.test.js --timeout=200000"</w:t>
-      </w:r>
-    </w:p>
-    <w:p>
-      <w:r>
-        <w:t>}</w:t>
-      </w:r>
-    </w:p>
-    <w:p>
-      <w:r>
-        <w:t>A execução da suíte foi realizada pelo comando:</w:t>
-      </w:r>
-    </w:p>
-    <w:p>
-      <w:proofErr w:type="spellStart"/>
-      <w:r>
-        <w:t>npm</w:t>
-      </w:r>
-      <w:proofErr w:type="spellEnd"/>
-      <w:r>
-        <w:t xml:space="preserve"> </w:t>
-      </w:r>
-      <w:proofErr w:type="spellStart"/>
-      <w:r>
-        <w:t>test</w:t>
-      </w:r>
-      <w:proofErr w:type="spellEnd"/>
-    </w:p>
-    <w:p>
-      <w:r>
-        <w:pict w14:anchorId="2AC0FEBE">
-          <v:rect id="_x0000_i1187" style="width:0;height:1.5pt" o:hralign="center" o:hrstd="t" o:hr="t" fillcolor="#a0a0a0" stroked="f"/>
-        </w:pict>
-      </w:r>
-    </w:p>
-    <w:p>
-      <w:pPr>
-        <w:rPr>
-          <w:b/>
-          <w:bCs/>
-        </w:rPr>
-      </w:pPr>
-      <w:r>
-        <w:rPr>
-          <w:b/>
-          <w:bCs/>
-        </w:rPr>
-        <w:t>7. GERAÇÃO DE RELATÓRIOS</w:t>
-      </w:r>
-    </w:p>
-    <w:p>
-      <w:r>
-        <w:t xml:space="preserve">Foi utilizada a biblioteca </w:t>
-      </w:r>
-      <w:proofErr w:type="spellStart"/>
-      <w:r>
-        <w:rPr>
-          <w:b/>
-          <w:bCs/>
-        </w:rPr>
+        <w:t xml:space="preserve"> e Chai para estruturar e executar testes automatizados, além do </w:t>
+      </w:r>
+      <w:proofErr w:type="spellStart"/>
+      <w:r>
         <w:t>Mochawesome</w:t>
       </w:r>
       <w:proofErr w:type="spellEnd"/>
       <w:r>
-        <w:t xml:space="preserve"> para geração dos relatórios de execução dos testes.</w:t>
-      </w:r>
-    </w:p>
-    <w:p>
-      <w:r>
-        <w:t>Instalação:</w:t>
-      </w:r>
-    </w:p>
-    <w:p>
-      <w:proofErr w:type="spellStart"/>
-      <w:r>
-        <w:t>npm</w:t>
-      </w:r>
-      <w:proofErr w:type="spellEnd"/>
-      <w:r>
-        <w:t xml:space="preserve"> </w:t>
-      </w:r>
-      <w:proofErr w:type="spellStart"/>
-      <w:r>
-        <w:t>install</w:t>
-      </w:r>
-      <w:proofErr w:type="spellEnd"/>
-      <w:r>
-        <w:t xml:space="preserve"> -D </w:t>
-      </w:r>
-      <w:proofErr w:type="spellStart"/>
-      <w:r>
-        <w:t>mochawesome</w:t>
-      </w:r>
-      <w:proofErr w:type="spellEnd"/>
-    </w:p>
-    <w:p>
-      <w:r>
-        <w:t xml:space="preserve">O script de execução foi configurado com o </w:t>
-      </w:r>
-      <w:proofErr w:type="spellStart"/>
-      <w:r>
-        <w:t>reporter</w:t>
-      </w:r>
-      <w:proofErr w:type="spellEnd"/>
-      <w:r>
-        <w:t>:</w:t>
-      </w:r>
-    </w:p>
-    <w:p>
-      <w:r>
-        <w:t>"scripts": {</w:t>
-      </w:r>
-    </w:p>
-    <w:p>
-      <w:r>
-        <w:t xml:space="preserve">  "</w:t>
-      </w:r>
-      <w:proofErr w:type="spellStart"/>
-      <w:r>
-        <w:t>test</w:t>
-      </w:r>
-      <w:proofErr w:type="spellEnd"/>
-      <w:r>
-        <w:t>": "mocha ./</w:t>
-      </w:r>
-      <w:proofErr w:type="spellStart"/>
-      <w:r>
-        <w:t>test</w:t>
-      </w:r>
-      <w:proofErr w:type="spellEnd"/>
-      <w:r>
-        <w:t>/**/*.test.js --timeout=200000 --</w:t>
-      </w:r>
-      <w:proofErr w:type="spellStart"/>
-      <w:r>
-        <w:t>reporter</w:t>
-      </w:r>
-      <w:proofErr w:type="spellEnd"/>
-      <w:r>
-        <w:t xml:space="preserve"> </w:t>
-      </w:r>
-      <w:proofErr w:type="spellStart"/>
-      <w:r>
-        <w:t>mochawesome</w:t>
-      </w:r>
-      <w:proofErr w:type="spellEnd"/>
-      <w:r>
-        <w:t>"</w:t>
-      </w:r>
-    </w:p>
-    <w:p>
-      <w:r>
-        <w:t>}</w:t>
-      </w:r>
-    </w:p>
-    <w:p>
-      <w:r>
-        <w:t>A pasta de relatórios foi tratada como um artefato temporário e adicionada ao .</w:t>
-      </w:r>
-      <w:proofErr w:type="spellStart"/>
-      <w:r>
-        <w:t>gitignore</w:t>
-      </w:r>
-      <w:proofErr w:type="spellEnd"/>
-      <w:r>
-        <w:t>.</w:t>
-      </w:r>
-    </w:p>
-    <w:p>
-      <w:r>
-        <w:t xml:space="preserve">Também foi criada a </w:t>
-      </w:r>
-      <w:proofErr w:type="spellStart"/>
-      <w:r>
-        <w:t>branch</w:t>
-      </w:r>
-      <w:proofErr w:type="spellEnd"/>
-      <w:r>
-        <w:t>:</w:t>
-      </w:r>
-    </w:p>
-    <w:p>
-      <w:proofErr w:type="spellStart"/>
-      <w:r>
-        <w:t>relatorio</w:t>
-      </w:r>
-      <w:proofErr w:type="spellEnd"/>
-      <w:r>
-        <w:t>-</w:t>
-      </w:r>
-      <w:proofErr w:type="spellStart"/>
-      <w:r>
-        <w:t>execucao</w:t>
-      </w:r>
-      <w:proofErr w:type="spellEnd"/>
-      <w:r>
-        <w:t>-testes</w:t>
-      </w:r>
-    </w:p>
-    <w:p>
-      <w:r>
-        <w:t xml:space="preserve">O fluxo de versionamento contemplou o envio das alterações ao GitHub e a integração com a </w:t>
-      </w:r>
-      <w:proofErr w:type="spellStart"/>
-      <w:r>
-        <w:t>branch</w:t>
-      </w:r>
-      <w:proofErr w:type="spellEnd"/>
-      <w:r>
-        <w:t xml:space="preserve"> principal.</w:t>
-      </w:r>
-    </w:p>
-    <w:p>
-      <w:r>
-        <w:pict w14:anchorId="48F9945E">
-          <v:rect id="_x0000_i1188" style="width:0;height:1.5pt" o:hralign="center" o:hrstd="t" o:hr="t" fillcolor="#a0a0a0" stroked="f"/>
-        </w:pict>
-      </w:r>
-    </w:p>
-    <w:p>
-      <w:pPr>
-        <w:rPr>
-          <w:b/>
-          <w:bCs/>
-        </w:rPr>
-      </w:pPr>
-      <w:r>
-        <w:rPr>
-          <w:b/>
-          <w:bCs/>
-        </w:rPr>
-        <w:t>8. SCRIPT DE TESTE PARA TRANSFERÊNCIAS</w:t>
-      </w:r>
-    </w:p>
-    <w:p>
-      <w:r>
-        <w:t xml:space="preserve">Os testes automatizados de transferência foram organizados como parte da aplicação prática dos conceitos apresentados no módulo, considerando os </w:t>
-      </w:r>
-      <w:proofErr w:type="spellStart"/>
-      <w:r>
-        <w:t>endpoints</w:t>
-      </w:r>
-      <w:proofErr w:type="spellEnd"/>
-      <w:r>
-        <w:t xml:space="preserve"> e as regras de negócio analisadas durante o estudo.</w:t>
-      </w:r>
-    </w:p>
-    <w:p>
-      <w:r>
-        <w:pict w14:anchorId="29BDAFB8">
-          <v:rect id="_x0000_i1189" style="width:0;height:1.5pt" o:hralign="center" o:hrstd="t" o:hr="t" fillcolor="#a0a0a0" stroked="f"/>
-        </w:pict>
-      </w:r>
-    </w:p>
-    <w:p>
-      <w:pPr>
-        <w:rPr>
-          <w:b/>
-          <w:bCs/>
-        </w:rPr>
-      </w:pPr>
-      <w:r>
-        <w:rPr>
-          <w:b/>
-          <w:bCs/>
-        </w:rPr>
-        <w:t>9. SÍNTESE DO APRENDIZADO</w:t>
-      </w:r>
-    </w:p>
-    <w:p>
-      <w:r>
-        <w:t xml:space="preserve">O módulo consolidou os principais conceitos relacionados aos testes de APIs REST, desde a análise dos </w:t>
-      </w:r>
-      <w:proofErr w:type="spellStart"/>
-      <w:r>
-        <w:t>endpoints</w:t>
-      </w:r>
-      <w:proofErr w:type="spellEnd"/>
-      <w:r>
-        <w:t xml:space="preserve"> e das regras de negócio até a identificação de cenários por meio da heurística VADER.</w:t>
-      </w:r>
-    </w:p>
-    <w:p>
+        <w:t xml:space="preserve"> para geração de relatórios.</w:t>
+      </w:r>
+    </w:p>
+    <w:p>
+      <w:pPr>
+        <w:spacing w:after="0"/>
+      </w:pPr>
       <w:r>
         <w:lastRenderedPageBreak/>
-        <w:t>Também foram estudados e aplicados conceitos de autenticação, autorização, métodos HTTP, validação de dados, códigos de erro, responsividade e análise de possíveis falhas na API.</w:t>
-      </w:r>
-    </w:p>
-    <w:p>
-      <w:r>
-        <w:t xml:space="preserve">Na etapa de automação, foram utilizados Mocha, </w:t>
-      </w:r>
-      <w:proofErr w:type="spellStart"/>
-      <w:r>
-        <w:t>SuperTest</w:t>
-      </w:r>
-      <w:proofErr w:type="spellEnd"/>
-      <w:r>
-        <w:t xml:space="preserve"> e Chai para estruturar e executar testes automatizados, além do </w:t>
-      </w:r>
-      <w:proofErr w:type="spellStart"/>
-      <w:r>
-        <w:t>Mochawesome</w:t>
-      </w:r>
-      <w:proofErr w:type="spellEnd"/>
-      <w:r>
-        <w:t xml:space="preserve"> para geração de relatórios.</w:t>
-      </w:r>
-    </w:p>
-    <w:p>
-      <w:r>
         <w:t>O conteúdo permitiu relacionar a análise funcional da API com a automação dos testes, proporcionando uma visão mais estruturada do processo de validação de serviços REST.</w:t>
       </w:r>
     </w:p>
-    <w:p/>
+    <w:p>
+      <w:pPr>
+        <w:spacing w:after="0"/>
+      </w:pPr>
+    </w:p>
     <w:sectPr>
       <w:pgSz w:w="11906" w:h="16838"/>
       <w:pgMar w:top="720" w:right="720" w:bottom="720" w:left="720" w:header="708" w:footer="708" w:gutter="0"/>
@@ -7058,6 +8848,21 @@
 
 <file path=word/numbering.xml><?xml version="1.0" encoding="utf-8"?>
 <w:numbering xmlns:wpc="http://schemas.microsoft.com/office/word/2010/wordprocessingCanvas" xmlns:cx="http://schemas.microsoft.com/office/drawing/2014/chartex" xmlns:cx1="http://schemas.microsoft.com/office/drawing/2015/9/8/chartex" xmlns:cx2="http://schemas.microsoft.com/office/drawing/2015/10/21/chartex" xmlns:cx3="http://schemas.microsoft.com/office/drawing/2016/5/9/chartex" xmlns:cx4="http://schemas.microsoft.com/office/drawing/2016/5/10/chartex" xmlns:cx5="http://schemas.microsoft.com/office/drawing/2016/5/11/chartex" xmlns:cx6="http://schemas.microsoft.com/office/drawing/2016/5/12/chartex" xmlns:cx7="http://schemas.microsoft.com/office/drawing/2016/5/13/chartex" xmlns:cx8="http://schemas.microsoft.com/office/drawing/2016/5/14/chartex" xmlns:mc="http://schemas.openxmlformats.org/markup-compatibility/2006" xmlns:aink="http://schemas.microsoft.com/office/drawing/2016/ink" xmlns:am3d="http://schemas.microsoft.com/office/drawing/2017/model3d" xmlns:o="urn:schemas-microsoft-com:office:office" xmlns:oel="http://schemas.microsoft.com/office/2019/extlst" xmlns:r="http://schemas.openxmlformats.org/officeDocument/2006/relationships" xmlns:m="http://schemas.openxmlformats.org/officeDocument/2006/math" xmlns:v="urn:schemas-microsoft-com:vml" xmlns:wp14="http://schemas.microsoft.com/office/word/2010/wordprocessingDrawing" xmlns:wp="http://schemas.openxmlformats.org/drawingml/2006/wordprocessingDrawing" xmlns:w10="urn:schemas-microsoft-com:office:word" xmlns:w="http://schemas.openxmlformats.org/wordprocessingml/2006/main" xmlns:w14="http://schemas.microsoft.com/office/word/2010/wordml" xmlns:w15="http://schemas.microsoft.com/office/word/2012/wordml" xmlns:w16cex="http://schemas.microsoft.com/office/word/2018/wordml/cex" xmlns:w16cid="http://schemas.microsoft.com/office/word/2016/wordml/cid" xmlns:w16="http://schemas.microsoft.com/office/word/2018/wordml" xmlns:w16du="http://schemas.microsoft.com/office/word/2023/wordml/word16du" xmlns:w16sdtdh="http://schemas.microsoft.com/office/word/2020/wordml/sdtdatahash" xmlns:w16sdtfl="http://schemas.microsoft.com/office/word/2024/wordml/sdtformatlock" xmlns:w16se="http://schemas.microsoft.com/office/word/2015/wordml/symex" xmlns:wpg="http://schemas.microsoft.com/office/word/2010/wordprocessingGroup" xmlns:wpi="http://schemas.microsoft.com/office/word/2010/wordprocessingInk" xmlns:wne="http://schemas.microsoft.com/office/word/2006/wordml" xmlns:wps="http://schemas.microsoft.com/office/word/2010/wordprocessingShape" mc:Ignorable="w14 w15 w16se w16cid w16 w16cex w16sdtdh w16sdtfl w16du wp14">
+  <w:numPicBullet w:numPicBulletId="0">
+    <w:pict>
+      <v:rect id="_x0000_i1025" style="width:0;height:1.5pt" o:hralign="center" o:bullet="t" o:hrstd="t" o:hr="t" fillcolor="#a0a0a0" stroked="f"/>
+    </w:pict>
+  </w:numPicBullet>
+  <w:numPicBullet w:numPicBulletId="1">
+    <w:pict>
+      <v:rect id="_x0000_i1026" style="width:0;height:1.5pt" o:hralign="center" o:bullet="t" o:hrstd="t" o:hr="t" fillcolor="#a0a0a0" stroked="f"/>
+    </w:pict>
+  </w:numPicBullet>
+  <w:numPicBullet w:numPicBulletId="2">
+    <w:pict>
+      <v:rect id="_x0000_i1027" style="width:0;height:1.5pt" o:hralign="center" o:bullet="t" o:hrstd="t" o:hr="t" fillcolor="#a0a0a0" stroked="f"/>
+    </w:pict>
+  </w:numPicBullet>
   <w:abstractNum w:abstractNumId="0" w15:restartNumberingAfterBreak="0">
     <w:nsid w:val="02F06A59"/>
     <w:multiLevelType w:val="hybridMultilevel"/>
@@ -8954,7 +10759,7 @@
   <w:style w:type="paragraph" w:default="1" w:styleId="Normal">
     <w:name w:val="Normal"/>
     <w:qFormat/>
-    <w:rsid w:val="009E5EDA"/>
+    <w:rsid w:val="00204BF9"/>
   </w:style>
   <w:style w:type="paragraph" w:styleId="Ttulo1">
     <w:name w:val="heading 1"/>

</xml_diff>